<commit_message>
docs: cap nhat nhat ky AI tap trung chuyen sau 4 phan he: kho hang, thu cung, don thuoc, phac do dieu tri
</commit_message>
<xml_diff>
--- a/NHAT_KY_AI_DU_AN.docx
+++ b/NHAT_KY_AI_DU_AN.docx
@@ -13,13 +13,13 @@
           <w:color w:val="6B7A86"/>
           <w:sz w:val="20"/>
         </w:rPr>
-        <w:t>BỘ GIÁO DỤC VÀ ĐÀO TẠO  •  KHOA CÔNG NGHỆ THÔNG TIN</w:t>
+        <w:t>BỘ GIÁO DỤC VÀ ĐÀO TẠO  •  ĐỀ ÁN PHÁT TRIỂN ỨNG DỤNG</w:t>
         <w:br/>
       </w:r>
     </w:p>
     <w:p>
       <w:pPr>
-        <w:spacing w:before="160" w:after="80"/>
+        <w:spacing w:before="120" w:after="80"/>
         <w:jc w:val="center"/>
       </w:pPr>
       <w:r>
@@ -27,7 +27,7 @@
           <w:rFonts w:ascii="Segoe UI" w:hAnsi="Segoe UI"/>
           <w:b/>
           <w:color w:val="1E3442"/>
-          <w:sz w:val="38"/>
+          <w:sz w:val="36"/>
         </w:rPr>
         <w:t>BÁO CÁO NHẬT KÝ SỬ DỤNG TRÍ TUỆ NHÂN TẠO</w:t>
         <w:br/>
@@ -36,7 +36,7 @@
     </w:p>
     <w:p>
       <w:pPr>
-        <w:spacing w:after="280"/>
+        <w:spacing w:after="240"/>
         <w:jc w:val="center"/>
       </w:pPr>
       <w:r>
@@ -44,9 +44,11 @@
           <w:rFonts w:ascii="Segoe UI" w:hAnsi="Segoe UI"/>
           <w:b/>
           <w:color w:val="56788A"/>
-          <w:sz w:val="24"/>
+          <w:sz w:val="22"/>
         </w:rPr>
-        <w:t>ĐỀ ÁN PHÁT TRIỂN ỨNG DỤNG: HỆ THỐNG QUẢN LÝ PHÒNG KHÁM THÚ Y &amp; PET SHOP (PETCARE POS)</w:t>
+        <w:t>PHÂN HỆ CHUYÊN TRÁCH: QUẢN LÝ THÚ CƯNG, KHO HÀNG, ĐƠN THUỐC &amp; PHÁC ĐỒ ĐIỀU TRỊ</w:t>
+        <w:br/>
+        <w:t>HỆ THỐNG QUẢN LÝ PHÒNG KHÁM THÚ Y (PETCARE POS)</w:t>
       </w:r>
     </w:p>
     <w:tbl>
@@ -89,7 +91,7 @@
                 <w:rFonts w:ascii="Segoe UI" w:hAnsi="Segoe UI"/>
                 <w:b/>
                 <w:color w:val="1E3442"/>
-                <w:sz w:val="20"/>
+                <w:sz w:val="19"/>
               </w:rPr>
               <w:t>Học phần:</w:t>
             </w:r>
@@ -114,7 +116,7 @@
               <w:rPr>
                 <w:rFonts w:ascii="Segoe UI" w:hAnsi="Segoe UI"/>
                 <w:color w:val="1F2A33"/>
-                <w:sz w:val="20"/>
+                <w:sz w:val="19"/>
               </w:rPr>
               <w:t>Đề án Phát triển Ứng dụng</w:t>
             </w:r>
@@ -142,7 +144,7 @@
                 <w:rFonts w:ascii="Segoe UI" w:hAnsi="Segoe UI"/>
                 <w:b/>
                 <w:color w:val="1E3442"/>
-                <w:sz w:val="20"/>
+                <w:sz w:val="19"/>
               </w:rPr>
               <w:t>Tên dự án:</w:t>
             </w:r>
@@ -167,9 +169,9 @@
               <w:rPr>
                 <w:rFonts w:ascii="Segoe UI" w:hAnsi="Segoe UI"/>
                 <w:color w:val="1F2A33"/>
-                <w:sz w:val="20"/>
+                <w:sz w:val="19"/>
               </w:rPr>
-              <w:t>Hệ thống Quản lý Phòng khám Thú y &amp; Pet Shop (PetCare POS)</w:t>
+              <w:t>Hệ thống Quản lý Phòng khám Thú y (PetCare POS)</w:t>
             </w:r>
           </w:p>
         </w:tc>
@@ -195,9 +197,9 @@
                 <w:rFonts w:ascii="Segoe UI" w:hAnsi="Segoe UI"/>
                 <w:b/>
                 <w:color w:val="1E3442"/>
-                <w:sz w:val="20"/>
+                <w:sz w:val="19"/>
               </w:rPr>
-              <w:t>Nền tảng &amp; Ngôn ngữ:</w:t>
+              <w:t>Phân hệ chuyên trách:</w:t>
             </w:r>
           </w:p>
         </w:tc>
@@ -220,9 +222,11 @@
               <w:rPr>
                 <w:rFonts w:ascii="Segoe UI" w:hAnsi="Segoe UI"/>
                 <w:color w:val="1F2A33"/>
-                <w:sz w:val="20"/>
+                <w:sz w:val="19"/>
               </w:rPr>
-              <w:t>Java 21 • Java Swing Custom UI • Microsoft SQL Server (JDBC)</w:t>
+              <w:t>1. Quản lý Thú cưng  •  2. Quản lý Kho hàng</w:t>
+              <w:br/>
+              <w:t>3. Quản lý Đơn thuốc  •  4. Lập &amp; Theo dõi Phác đồ Điều trị</w:t>
             </w:r>
           </w:p>
         </w:tc>
@@ -248,9 +252,9 @@
                 <w:rFonts w:ascii="Segoe UI" w:hAnsi="Segoe UI"/>
                 <w:b/>
                 <w:color w:val="1E3442"/>
-                <w:sz w:val="20"/>
+                <w:sz w:val="19"/>
               </w:rPr>
-              <w:t>Kiến trúc phần mềm:</w:t>
+              <w:t>Sinh viên thực hiện:</w:t>
             </w:r>
           </w:p>
         </w:tc>
@@ -273,9 +277,9 @@
               <w:rPr>
                 <w:rFonts w:ascii="Segoe UI" w:hAnsi="Segoe UI"/>
                 <w:color w:val="1F2A33"/>
-                <w:sz w:val="20"/>
+                <w:sz w:val="19"/>
               </w:rPr>
-              <w:t>Mô hình 3 lớp phân tầng chuẩn (Entity – DAO – BUS – GUI)</w:t>
+              <w:t>Nguyễn Ngọc Toàn</w:t>
             </w:r>
           </w:p>
         </w:tc>
@@ -301,9 +305,9 @@
                 <w:rFonts w:ascii="Segoe UI" w:hAnsi="Segoe UI"/>
                 <w:b/>
                 <w:color w:val="1E3442"/>
-                <w:sz w:val="20"/>
+                <w:sz w:val="19"/>
               </w:rPr>
-              <w:t>Sinh viên phụ trách:</w:t>
+              <w:t>Công nghệ &amp; Nền tảng:</w:t>
             </w:r>
           </w:p>
         </w:tc>
@@ -326,9 +330,9 @@
               <w:rPr>
                 <w:rFonts w:ascii="Segoe UI" w:hAnsi="Segoe UI"/>
                 <w:color w:val="1F2A33"/>
-                <w:sz w:val="20"/>
+                <w:sz w:val="19"/>
               </w:rPr>
-              <w:t>Nguyễn Ngọc Toàn (Cùng nhóm: Hữu Thịnh, Lê Tuấn Anh, Võ Quốc Trung)</w:t>
+              <w:t>Java 21  •  Java Swing Custom Flat UI  •  SQL Server (JDBC)</w:t>
             </w:r>
           </w:p>
         </w:tc>
@@ -354,9 +358,9 @@
                 <w:rFonts w:ascii="Segoe UI" w:hAnsi="Segoe UI"/>
                 <w:b/>
                 <w:color w:val="1E3442"/>
-                <w:sz w:val="20"/>
+                <w:sz w:val="19"/>
               </w:rPr>
-              <w:t>Kho mã nguồn (GitHub):</w:t>
+              <w:t>Kho lưu trữ GitHub:</w:t>
             </w:r>
           </w:p>
         </w:tc>
@@ -379,7 +383,7 @@
               <w:rPr>
                 <w:rFonts w:ascii="Segoe UI" w:hAnsi="Segoe UI"/>
                 <w:color w:val="1F2A33"/>
-                <w:sz w:val="20"/>
+                <w:sz w:val="19"/>
               </w:rPr>
               <w:t>oggytriet123/de_an_phat_trien_ung_dung (Nhánh: ngoc-toan)</w:t>
             </w:r>
@@ -395,232 +399,16 @@
     <w:p>
       <w:pPr>
         <w:keepNext/>
-        <w:spacing w:before="260" w:after="80"/>
-      </w:pPr>
-      <w:r>
-        <w:rPr>
-          <w:rFonts w:ascii="Segoe UI" w:hAnsi="Segoe UI"/>
-          <w:b/>
-          <w:color w:val="56788A"/>
-          <w:sz w:val="25"/>
-        </w:rPr>
-        <w:t>MỤC LỤC BÁO CÁO</w:t>
-      </w:r>
-    </w:p>
-    <w:p>
-      <w:pPr>
-        <w:spacing w:after="40" w:line="288" w:lineRule="auto"/>
-      </w:pPr>
-      <w:r>
-        <w:rPr>
-          <w:rFonts w:ascii="Segoe UI" w:hAnsi="Segoe UI"/>
-          <w:i w:val="0"/>
-          <w:color w:val="1F2A33"/>
-          <w:sz w:val="22"/>
-        </w:rPr>
-        <w:t>1. TỔNG QUAN VÀ CHIẾN LƯỢC ỨNG DỤNG AI</w:t>
-      </w:r>
-    </w:p>
-    <w:p>
-      <w:pPr>
-        <w:spacing w:after="40" w:line="288" w:lineRule="auto"/>
-      </w:pPr>
-      <w:r>
-        <w:rPr>
-          <w:rFonts w:ascii="Segoe UI" w:hAnsi="Segoe UI"/>
-          <w:i w:val="0"/>
-          <w:color w:val="1F2A33"/>
-          <w:sz w:val="22"/>
-        </w:rPr>
-        <w:t>2. CÔNG CỤ AI VÀ MÔ HÌNH HỢP TÁC (AI PAIR-PROGRAMMING)</w:t>
-      </w:r>
-    </w:p>
-    <w:p>
-      <w:pPr>
-        <w:spacing w:after="40" w:line="288" w:lineRule="auto"/>
-      </w:pPr>
-      <w:r>
-        <w:rPr>
-          <w:rFonts w:ascii="Segoe UI" w:hAnsi="Segoe UI"/>
-          <w:i w:val="0"/>
-          <w:color w:val="1F2A33"/>
-          <w:sz w:val="22"/>
-        </w:rPr>
-        <w:t>3. NGUYÊN TẮC VÀ KỸ THUẬT PROMPT ENGINEERING ĐÃ ÁP DỤNG</w:t>
-      </w:r>
-    </w:p>
-    <w:p>
-      <w:pPr>
-        <w:spacing w:after="40" w:line="288" w:lineRule="auto"/>
-      </w:pPr>
-      <w:r>
-        <w:rPr>
-          <w:rFonts w:ascii="Segoe UI" w:hAnsi="Segoe UI"/>
-          <w:i w:val="0"/>
-          <w:color w:val="1F2A33"/>
-          <w:sz w:val="22"/>
-        </w:rPr>
-        <w:t>4. NHẬT KÝ CHI TIẾT CÁC PHIÊN LÀM VIỆC VỚI AI THEO GIAI ĐOẠN</w:t>
-      </w:r>
-    </w:p>
-    <w:p>
-      <w:pPr>
-        <w:spacing w:after="40" w:line="288" w:lineRule="auto"/>
-      </w:pPr>
-      <w:r>
-        <w:rPr>
-          <w:rFonts w:ascii="Segoe UI" w:hAnsi="Segoe UI"/>
-          <w:i w:val="0"/>
-          <w:color w:val="1F2A33"/>
-          <w:sz w:val="22"/>
-        </w:rPr>
-        <w:t xml:space="preserve">   - Giai đoạn 1: Khởi tạo kiến trúc, CSDL &amp; Design System</w:t>
-      </w:r>
-    </w:p>
-    <w:p>
-      <w:pPr>
-        <w:spacing w:after="40" w:line="288" w:lineRule="auto"/>
-      </w:pPr>
-      <w:r>
-        <w:rPr>
-          <w:rFonts w:ascii="Segoe UI" w:hAnsi="Segoe UI"/>
-          <w:i w:val="0"/>
-          <w:color w:val="1F2A33"/>
-          <w:sz w:val="22"/>
-        </w:rPr>
-        <w:t xml:space="preserve">   - Giai đoạn 2: Quản lý Thú cưng &amp; Lưu trú Lồng chuồng</w:t>
-      </w:r>
-    </w:p>
-    <w:p>
-      <w:pPr>
-        <w:spacing w:after="40" w:line="288" w:lineRule="auto"/>
-      </w:pPr>
-      <w:r>
-        <w:rPr>
-          <w:rFonts w:ascii="Segoe UI" w:hAnsi="Segoe UI"/>
-          <w:i w:val="0"/>
-          <w:color w:val="1F2A33"/>
-          <w:sz w:val="22"/>
-        </w:rPr>
-        <w:t xml:space="preserve">   - Giai đoạn 3: Quản lý Kho hàng &amp; Lịch sử Nhập - Xuất</w:t>
-      </w:r>
-    </w:p>
-    <w:p>
-      <w:pPr>
-        <w:spacing w:after="40" w:line="288" w:lineRule="auto"/>
-      </w:pPr>
-      <w:r>
-        <w:rPr>
-          <w:rFonts w:ascii="Segoe UI" w:hAnsi="Segoe UI"/>
-          <w:i w:val="0"/>
-          <w:color w:val="1F2A33"/>
-          <w:sz w:val="22"/>
-        </w:rPr>
-        <w:t xml:space="preserve">   - Giai đoạn 4: Quản lý Lịch hẹn (5 chế độ vận hành)</w:t>
-      </w:r>
-    </w:p>
-    <w:p>
-      <w:pPr>
-        <w:spacing w:after="40" w:line="288" w:lineRule="auto"/>
-      </w:pPr>
-      <w:r>
-        <w:rPr>
-          <w:rFonts w:ascii="Segoe UI" w:hAnsi="Segoe UI"/>
-          <w:i w:val="0"/>
-          <w:color w:val="1F2A33"/>
-          <w:sz w:val="22"/>
-        </w:rPr>
-        <w:t xml:space="preserve">   - Giai đoạn 5: Phân hệ Điều trị y tế: Đơn thuốc &amp; Phác đồ điều trị</w:t>
-      </w:r>
-    </w:p>
-    <w:p>
-      <w:pPr>
-        <w:spacing w:after="40" w:line="288" w:lineRule="auto"/>
-      </w:pPr>
-      <w:r>
-        <w:rPr>
-          <w:rFonts w:ascii="Segoe UI" w:hAnsi="Segoe UI"/>
-          <w:i w:val="0"/>
-          <w:color w:val="1F2A33"/>
-          <w:sz w:val="22"/>
-        </w:rPr>
-        <w:t xml:space="preserve">   - Giai đoạn 6: Debug, Tối ưu giao diện &amp; Giải quyết xung đột UI</w:t>
-      </w:r>
-    </w:p>
-    <w:p>
-      <w:pPr>
-        <w:spacing w:after="40" w:line="288" w:lineRule="auto"/>
-      </w:pPr>
-      <w:r>
-        <w:rPr>
-          <w:rFonts w:ascii="Segoe UI" w:hAnsi="Segoe UI"/>
-          <w:i w:val="0"/>
-          <w:color w:val="1F2A33"/>
-          <w:sz w:val="22"/>
-        </w:rPr>
-        <w:t xml:space="preserve">   - Giai đoạn 7: Fix lỗi Môi trường, Offline Fallback &amp; Đồng bộ Git</w:t>
-      </w:r>
-    </w:p>
-    <w:p>
-      <w:pPr>
-        <w:spacing w:after="40" w:line="288" w:lineRule="auto"/>
-      </w:pPr>
-      <w:r>
-        <w:rPr>
-          <w:rFonts w:ascii="Segoe UI" w:hAnsi="Segoe UI"/>
-          <w:i w:val="0"/>
-          <w:color w:val="1F2A33"/>
-          <w:sz w:val="22"/>
-        </w:rPr>
-        <w:t>5. ĐÁNH GIÁ ĐỊNH LƯỢNG VÀ HIỆU QUẢ CỦA AI TRONG DỰ ÁN</w:t>
-      </w:r>
-    </w:p>
-    <w:p>
-      <w:pPr>
-        <w:spacing w:after="40" w:line="288" w:lineRule="auto"/>
-      </w:pPr>
-      <w:r>
-        <w:rPr>
-          <w:rFonts w:ascii="Segoe UI" w:hAnsi="Segoe UI"/>
-          <w:i w:val="0"/>
-          <w:color w:val="1F2A33"/>
-          <w:sz w:val="22"/>
-        </w:rPr>
-        <w:t>6. THÁCH THỨC, HẠN CHẾ VÀ BÀI HỌC KINH NGHIỆM</w:t>
-      </w:r>
-    </w:p>
-    <w:p>
-      <w:pPr>
-        <w:spacing w:after="40" w:line="288" w:lineRule="auto"/>
-      </w:pPr>
-      <w:r>
-        <w:rPr>
-          <w:rFonts w:ascii="Segoe UI" w:hAnsi="Segoe UI"/>
-          <w:i w:val="0"/>
-          <w:color w:val="1F2A33"/>
-          <w:sz w:val="22"/>
-        </w:rPr>
-        <w:t>7. KẾT LUẬN VÀ HƯỚNG PHÁT TRIỂN TIẾP THEO</w:t>
-      </w:r>
-    </w:p>
-    <w:p>
-      <w:pPr>
-        <w:spacing w:after="240"/>
-      </w:pPr>
-    </w:p>
-    <w:p>
-      <w:pPr>
-        <w:keepNext/>
-        <w:spacing w:before="360" w:after="120"/>
+        <w:spacing w:before="320" w:after="120"/>
       </w:pPr>
       <w:r>
         <w:rPr>
           <w:rFonts w:ascii="Segoe UI" w:hAnsi="Segoe UI"/>
           <w:b/>
           <w:color w:val="1E3442"/>
-          <w:sz w:val="30"/>
+          <w:sz w:val="29"/>
         </w:rPr>
-        <w:t>1. TỔNG QUAN VÀ CHIẾN LƯỢC ỨNG DỤNG AI</w:t>
+        <w:t>1. TỔNG QUAN &amp; PHẠM VI NGHIỆP VỤ 4 CHỨC NĂNG TRỌNG TÂM</w:t>
       </w:r>
     </w:p>
     <w:p>
@@ -634,30 +422,7 @@
           <w:color w:val="1F2A33"/>
           <w:sz w:val="22"/>
         </w:rPr>
-        <w:t>Trong khuôn khổ Đề án Phát triển Ứng dụng, mục tiêu cốt lõi của nhóm là xây dựng phần mềm quản lý chuyên nghiệp cho chuỗi bệnh viện / phòng khám thú y và cửa hàng thú cưng (PetCare POS). Hệ thống tích hợp toàn diện từ tiếp nhận thú cưng, lưu chuồng nội trú, khám bệnh lâm sàng, kê đơn thuốc điện tử, theo dõi phác đồ điều trị đa giai đoạn, quản lý xuất nhập kho dược phẩm đến thanh toán hóa đơn POS và thống kê tài chính.</w:t>
-      </w:r>
-    </w:p>
-    <w:p>
-      <w:pPr>
-        <w:spacing w:after="80" w:line="288" w:lineRule="auto"/>
-      </w:pPr>
-      <w:r>
-        <w:rPr>
-          <w:rFonts w:ascii="Segoe UI" w:hAnsi="Segoe UI"/>
-          <w:b/>
-          <w:color w:val="1F2A33"/>
-          <w:sz w:val="22"/>
-        </w:rPr>
-        <w:t xml:space="preserve">Bối cảnh và thách thức: </w:t>
-      </w:r>
-      <w:r>
-        <w:rPr>
-          <w:rFonts w:ascii="Segoe UI" w:hAnsi="Segoe UI"/>
-          <w:i w:val="0"/>
-          <w:color w:val="1F2A33"/>
-          <w:sz w:val="22"/>
-        </w:rPr>
-        <w:t>Thách thức kỹ thuật lớn nhất của các ứng dụng Desktop sử dụng Java Swing truyền thống:</w:t>
+        <w:t>Trong Đề án Phát triển Ứng dụng Quản lý Phòng khám Thú y (PetCare POS), sinh viên Nguyễn Ngọc Toàn trực tiếp chịu trách nhiệm nghiên cứu, thiết kế kiến trúc 3 lớp, xây dựng nghiệp vụ BUS và lập trình giao diện UI/UX cho 4 phân hệ cốt lõi tạo thành chu trình khám chữa bệnh khép kín:</w:t>
       </w:r>
     </w:p>
     <w:p>
@@ -673,7 +438,7 @@
           <w:color w:val="1F2A33"/>
           <w:sz w:val="21"/>
         </w:rPr>
-        <w:t xml:space="preserve">Thẩm mỹ giao diện: </w:t>
+        <w:t xml:space="preserve">1. Quản lý Thú cưng (ThuCungPanel): </w:t>
       </w:r>
       <w:r>
         <w:rPr>
@@ -681,7 +446,7 @@
           <w:color w:val="1F2A33"/>
           <w:sz w:val="21"/>
         </w:rPr>
-        <w:t>Giao diện mặc định (Metal, Windows Classic) thường thô cứng, nặng nề, thiếu tính thẩm mỹ hiện đại của các phần mềm SaaS thương mại ngày nay.</w:t>
+        <w:t>Tiếp nhận hồ sơ bệnh nhân thú cưng, lưu trữ ảnh đại diện (avatar bo tròn), giống loài, cân nặng, tình trạng sức khỏe; cung cấp menu ngữ cảnh chuột phải mở nhanh chức năng kê đơn thuốc hoặc phác đồ điều trị.</w:t>
       </w:r>
     </w:p>
     <w:p>
@@ -697,7 +462,7 @@
           <w:color w:val="1F2A33"/>
           <w:sz w:val="21"/>
         </w:rPr>
-        <w:t xml:space="preserve">Bố cục và độ co giãn: </w:t>
+        <w:t xml:space="preserve">2. Quản lý Kho hàng (KhoHangPanel &amp; LichSuNhapXuatPanel): </w:t>
       </w:r>
       <w:r>
         <w:rPr>
@@ -705,7 +470,7 @@
           <w:color w:val="1F2A33"/>
           <w:sz w:val="21"/>
         </w:rPr>
-        <w:t>Cơ chế LayoutManager của Swing rất phức tạp. Khi kích thước form thay đổi hoặc co giãn trên màn hình độ phân giải cao (High DPI), các thành phần rất dễ bị vỡ khung, đè chồng lấn lên nhau.</w:t>
+        <w:t>Quản lý danh mục dược phẩm, vaccine, vật tư y tế; theo dõi số lượng tồn kho, cảnh báo thuốc sắp hết hạn / tồn thấp (&lt; 10); pop-up lịch CalendarPicker chọn ngày; tự động cập nhật số lượng tồn khi xuất đơn thuốc thông qua Observer Pattern.</w:t>
       </w:r>
     </w:p>
     <w:p>
@@ -721,7 +486,7 @@
           <w:color w:val="1F2A33"/>
           <w:sz w:val="21"/>
         </w:rPr>
-        <w:t xml:space="preserve">Độ phức tạp nghiệp vụ: </w:t>
+        <w:t xml:space="preserve">3. Quản lý Đơn thuốc (DonThuocPanel): </w:t>
       </w:r>
       <w:r>
         <w:rPr>
@@ -729,7 +494,31 @@
           <w:color w:val="1F2A33"/>
           <w:sz w:val="21"/>
         </w:rPr>
-        <w:t>Nghiệp vụ y tế thú y có tính liên kết dữ liệu đa chiều: thú cưng liên kết bệnh án, bệnh án gắn liền với phác đồ, phác đồ kết nối với đơn thuốc, đơn thuốc tự động trừ kho thuốc và sinh hóa đơn viện phí.</w:t>
+        <w:t>Kê đơn thuốc điều trị trực tiếp, cho phép bác sĩ bấm nút '+ Chọn thuốc từ kho' để tra cứu kho hàng và tự động điền đơn giá; kiểm tra tồn kho, cảnh báo xuất vượt; tự động trừ kho thuốc khi hoàn tất đơn.</w:t>
+      </w:r>
+    </w:p>
+    <w:p>
+      <w:pPr>
+        <w:pStyle w:val="ListBullet"/>
+        <w:spacing w:after="60" w:line="276" w:lineRule="auto"/>
+        <w:ind w:left="360"/>
+      </w:pPr>
+      <w:r>
+        <w:rPr>
+          <w:rFonts w:ascii="Segoe UI" w:hAnsi="Segoe UI"/>
+          <w:b/>
+          <w:color w:val="1F2A33"/>
+          <w:sz w:val="21"/>
+        </w:rPr>
+        <w:t xml:space="preserve">4. Lập &amp; Theo dõi Phác đồ Điều trị (PhacDoPanel): </w:t>
+      </w:r>
+      <w:r>
+        <w:rPr>
+          <w:rFonts w:ascii="Segoe UI" w:hAnsi="Segoe UI"/>
+          <w:color w:val="1F2A33"/>
+          <w:sz w:val="21"/>
+        </w:rPr>
+        <w:t>Thiết lập phác đồ điều trị đa giai đoạn (Giai đoạn tấn công, duy trì, phục hồi); theo dõi diễn tiến lâm sàng hàng ngày (thân nhiệt, cân nặng, triệu chứng); thanh trượt % tiến độ tương tác; bảng nhật ký theo dõi 6 cột; giải quyết triệt để lỗi xung đột layout giao diện.</w:t>
       </w:r>
     </w:p>
     <w:tbl>
@@ -748,10 +537,10 @@
             <w:tcW w:type="dxa" w:w="9648"/>
             <w:shd w:fill="F3F6F8"/>
             <w:tcMar>
-              <w:top w:w="140" w:type="dxa"/>
-              <w:bottom w:w="140" w:type="dxa"/>
-              <w:left w:w="200" w:type="dxa"/>
-              <w:right w:w="160" w:type="dxa"/>
+              <w:top w:w="120" w:type="dxa"/>
+              <w:bottom w:w="120" w:type="dxa"/>
+              <w:left w:w="180" w:type="dxa"/>
+              <w:right w:w="140" w:type="dxa"/>
             </w:tcMar>
             <w:tcBorders>
               <w:top w:val="none"/>
@@ -771,7 +560,7 @@
                 <w:color w:val="1E3442"/>
                 <w:sz w:val="21"/>
               </w:rPr>
-              <w:t>Chiến lược tiếp cận AI có kiểm soát:</w:t>
+              <w:t>Chu trình khám chữa bệnh &amp; quản trị kho liên hoàn:</w:t>
               <w:br/>
             </w:r>
             <w:r>
@@ -781,7 +570,7 @@
                 <w:color w:val="1F2A33"/>
                 <w:sz w:val="21"/>
               </w:rPr>
-              <w:t>Nhóm xác định Trí tuệ Nhân tạo (AI Agentic Coding) đóng vai trò là một 'Kỹ sư Phần mềm Cấp cao (Senior Software Engineer &amp; UI/UX Specialist)' đồng hành xuyên suốt vòng đời phát triển phần mềm (SDLC). Người lập trình giữ vai trò trung tâm (Human-in-the-loop) để kiểm soát kiến trúc, thẩm định chất lượng mã nguồn và nghiệm thu nghiệp vụ thực tế.</w:t>
+              <w:t>Mối quan hệ dữ liệu khép kín: Thú cưng (Bệnh nhân) ➔ Khởi tạo Phác đồ Điều trị ➔ Bác sĩ kê Đơn thuốc theo phác đồ ➔ Tự động trừ tồn kho Dược phẩm &amp; Cảnh báo hết hàng.</w:t>
             </w:r>
           </w:p>
         </w:tc>
@@ -795,377 +584,30 @@
     <w:p>
       <w:pPr>
         <w:keepNext/>
-        <w:spacing w:before="360" w:after="120"/>
+        <w:spacing w:before="320" w:after="120"/>
       </w:pPr>
       <w:r>
         <w:rPr>
           <w:rFonts w:ascii="Segoe UI" w:hAnsi="Segoe UI"/>
           <w:b/>
           <w:color w:val="1E3442"/>
-          <w:sz w:val="30"/>
+          <w:sz w:val="29"/>
         </w:rPr>
         <w:t>2. CÔNG CỤ AI VÀ MÔ HÌNH HỢP TÁC (AI PAIR-PROGRAMMING)</w:t>
       </w:r>
     </w:p>
     <w:p>
       <w:pPr>
-        <w:keepNext/>
-        <w:spacing w:before="260" w:after="80"/>
+        <w:spacing w:after="80" w:line="288" w:lineRule="auto"/>
       </w:pPr>
       <w:r>
         <w:rPr>
           <w:rFonts w:ascii="Segoe UI" w:hAnsi="Segoe UI"/>
-          <w:b/>
-          <w:color w:val="56788A"/>
-          <w:sz w:val="25"/>
+          <w:i w:val="0"/>
+          <w:color w:val="1F2A33"/>
+          <w:sz w:val="22"/>
         </w:rPr>
-        <w:t>2.1. Các công cụ AI chính được tích hợp trong dự án</w:t>
-      </w:r>
-    </w:p>
-    <w:tbl>
-      <w:tblPr>
-        <w:tblW w:type="auto" w:w="0"/>
-        <w:jc w:val="center"/>
-        <w:tblLayout w:type="fixed"/>
-        <w:tblLook w:firstColumn="1" w:firstRow="1" w:lastColumn="0" w:lastRow="0" w:noHBand="0" w:noVBand="1" w:val="04A0"/>
-        <w:tblBorders>
-          <w:top w:val="single" w:sz="6" w:space="0" w:color="DDE3E8"/>
-          <w:bottom w:val="single" w:sz="6" w:space="0" w:color="DDE3E8"/>
-          <w:left w:val="none"/>
-          <w:right w:val="none"/>
-          <w:insideH w:val="single" w:sz="4" w:space="0" w:color="DDE3E8"/>
-          <w:insideV w:val="none"/>
-        </w:tblBorders>
-      </w:tblPr>
-      <w:tblGrid>
-        <w:gridCol w:w="2592"/>
-        <w:gridCol w:w="2304"/>
-        <w:gridCol w:w="4464"/>
-      </w:tblGrid>
-      <w:tr>
-        <w:tc>
-          <w:tcPr>
-            <w:tcW w:type="dxa" w:w="3216"/>
-            <w:shd w:fill="1E3442"/>
-            <w:tcMar>
-              <w:top w:w="100" w:type="dxa"/>
-              <w:bottom w:w="100" w:type="dxa"/>
-              <w:left w:w="120" w:type="dxa"/>
-              <w:right w:w="120" w:type="dxa"/>
-            </w:tcMar>
-          </w:tcPr>
-          <w:p>
-            <w:r>
-              <w:rPr>
-                <w:rFonts w:ascii="Segoe UI" w:hAnsi="Segoe UI"/>
-                <w:b/>
-                <w:color w:val="FFFFFF"/>
-                <w:sz w:val="20"/>
-              </w:rPr>
-              <w:t>Công cụ / Nền tảng</w:t>
-            </w:r>
-          </w:p>
-        </w:tc>
-        <w:tc>
-          <w:tcPr>
-            <w:tcW w:type="dxa" w:w="3216"/>
-            <w:shd w:fill="1E3442"/>
-            <w:tcMar>
-              <w:top w:w="100" w:type="dxa"/>
-              <w:bottom w:w="100" w:type="dxa"/>
-              <w:left w:w="120" w:type="dxa"/>
-              <w:right w:w="120" w:type="dxa"/>
-            </w:tcMar>
-          </w:tcPr>
-          <w:p>
-            <w:r>
-              <w:rPr>
-                <w:rFonts w:ascii="Segoe UI" w:hAnsi="Segoe UI"/>
-                <w:b/>
-                <w:color w:val="FFFFFF"/>
-                <w:sz w:val="20"/>
-              </w:rPr>
-              <w:t>Phiên bản / Model</w:t>
-            </w:r>
-          </w:p>
-        </w:tc>
-        <w:tc>
-          <w:tcPr>
-            <w:tcW w:type="dxa" w:w="3216"/>
-            <w:shd w:fill="1E3442"/>
-            <w:tcMar>
-              <w:top w:w="100" w:type="dxa"/>
-              <w:bottom w:w="100" w:type="dxa"/>
-              <w:left w:w="120" w:type="dxa"/>
-              <w:right w:w="120" w:type="dxa"/>
-            </w:tcMar>
-          </w:tcPr>
-          <w:p>
-            <w:r>
-              <w:rPr>
-                <w:rFonts w:ascii="Segoe UI" w:hAnsi="Segoe UI"/>
-                <w:b/>
-                <w:color w:val="FFFFFF"/>
-                <w:sz w:val="20"/>
-              </w:rPr>
-              <w:t>Vai trò cốt lõi trong dự án</w:t>
-            </w:r>
-          </w:p>
-        </w:tc>
-      </w:tr>
-      <w:tr>
-        <w:tc>
-          <w:tcPr>
-            <w:tcW w:type="dxa" w:w="3216"/>
-            <w:shd w:fill="FFFFFF"/>
-            <w:tcMar>
-              <w:top w:w="80" w:type="dxa"/>
-              <w:bottom w:w="80" w:type="dxa"/>
-              <w:left w:w="100" w:type="dxa"/>
-              <w:right w:w="100" w:type="dxa"/>
-            </w:tcMar>
-          </w:tcPr>
-          <w:p>
-            <w:pPr>
-              <w:spacing w:after="0"/>
-            </w:pPr>
-            <w:r>
-              <w:rPr>
-                <w:rFonts w:ascii="Segoe UI" w:hAnsi="Segoe UI"/>
-                <w:b/>
-                <w:color w:val="1F2A33"/>
-                <w:sz w:val="19"/>
-              </w:rPr>
-              <w:t>Antigravity AI (Google DeepMind)</w:t>
-            </w:r>
-          </w:p>
-        </w:tc>
-        <w:tc>
-          <w:tcPr>
-            <w:tcW w:type="dxa" w:w="3216"/>
-            <w:shd w:fill="FFFFFF"/>
-            <w:tcMar>
-              <w:top w:w="80" w:type="dxa"/>
-              <w:bottom w:w="80" w:type="dxa"/>
-              <w:left w:w="100" w:type="dxa"/>
-              <w:right w:w="100" w:type="dxa"/>
-            </w:tcMar>
-          </w:tcPr>
-          <w:p>
-            <w:pPr>
-              <w:spacing w:after="0"/>
-            </w:pPr>
-            <w:r>
-              <w:rPr>
-                <w:rFonts w:ascii="Segoe UI" w:hAnsi="Segoe UI"/>
-                <w:color w:val="1F2A33"/>
-                <w:sz w:val="19"/>
-              </w:rPr>
-              <w:t>Agentic AI Pair-Programmer</w:t>
-            </w:r>
-          </w:p>
-        </w:tc>
-        <w:tc>
-          <w:tcPr>
-            <w:tcW w:type="dxa" w:w="3216"/>
-            <w:shd w:fill="FFFFFF"/>
-            <w:tcMar>
-              <w:top w:w="80" w:type="dxa"/>
-              <w:bottom w:w="80" w:type="dxa"/>
-              <w:left w:w="100" w:type="dxa"/>
-              <w:right w:w="100" w:type="dxa"/>
-            </w:tcMar>
-          </w:tcPr>
-          <w:p>
-            <w:pPr>
-              <w:spacing w:after="0"/>
-            </w:pPr>
-            <w:r>
-              <w:rPr>
-                <w:rFonts w:ascii="Segoe UI" w:hAnsi="Segoe UI"/>
-                <w:color w:val="1F2A33"/>
-                <w:sz w:val="19"/>
-              </w:rPr>
-              <w:t>Thiết kế hệ thống, tái cấu trúc giao diện, giải quyết xung đột layout, vẽ vector icon bằng Java 2D Graphics, quản lý micro-commits Git.</w:t>
-            </w:r>
-          </w:p>
-        </w:tc>
-      </w:tr>
-      <w:tr>
-        <w:tc>
-          <w:tcPr>
-            <w:tcW w:type="dxa" w:w="3216"/>
-            <w:shd w:fill="F8FAFC"/>
-            <w:tcMar>
-              <w:top w:w="80" w:type="dxa"/>
-              <w:bottom w:w="80" w:type="dxa"/>
-              <w:left w:w="100" w:type="dxa"/>
-              <w:right w:w="100" w:type="dxa"/>
-            </w:tcMar>
-          </w:tcPr>
-          <w:p>
-            <w:pPr>
-              <w:spacing w:after="0"/>
-            </w:pPr>
-            <w:r>
-              <w:rPr>
-                <w:rFonts w:ascii="Segoe UI" w:hAnsi="Segoe UI"/>
-                <w:b/>
-                <w:color w:val="1F2A33"/>
-                <w:sz w:val="19"/>
-              </w:rPr>
-              <w:t>ChatGPT / Claude</w:t>
-            </w:r>
-          </w:p>
-        </w:tc>
-        <w:tc>
-          <w:tcPr>
-            <w:tcW w:type="dxa" w:w="3216"/>
-            <w:shd w:fill="F8FAFC"/>
-            <w:tcMar>
-              <w:top w:w="80" w:type="dxa"/>
-              <w:bottom w:w="80" w:type="dxa"/>
-              <w:left w:w="100" w:type="dxa"/>
-              <w:right w:w="100" w:type="dxa"/>
-            </w:tcMar>
-          </w:tcPr>
-          <w:p>
-            <w:pPr>
-              <w:spacing w:after="0"/>
-            </w:pPr>
-            <w:r>
-              <w:rPr>
-                <w:rFonts w:ascii="Segoe UI" w:hAnsi="Segoe UI"/>
-                <w:color w:val="1F2A33"/>
-                <w:sz w:val="19"/>
-              </w:rPr>
-              <w:t>GPT-4o / Claude 3.5 Sonnet</w:t>
-            </w:r>
-          </w:p>
-        </w:tc>
-        <w:tc>
-          <w:tcPr>
-            <w:tcW w:type="dxa" w:w="3216"/>
-            <w:shd w:fill="F8FAFC"/>
-            <w:tcMar>
-              <w:top w:w="80" w:type="dxa"/>
-              <w:bottom w:w="80" w:type="dxa"/>
-              <w:left w:w="100" w:type="dxa"/>
-              <w:right w:w="100" w:type="dxa"/>
-            </w:tcMar>
-          </w:tcPr>
-          <w:p>
-            <w:pPr>
-              <w:spacing w:after="0"/>
-            </w:pPr>
-            <w:r>
-              <w:rPr>
-                <w:rFonts w:ascii="Segoe UI" w:hAnsi="Segoe UI"/>
-                <w:color w:val="1F2A33"/>
-                <w:sz w:val="19"/>
-              </w:rPr>
-              <w:t>Khởi thảo lược đồ CSDL SQL Server, gợi ý luồng nghiệp vụ y tế thú cưng chuẩn quốc tế, soạn thảo và chuẩn hóa tài liệu kỹ thuật.</w:t>
-            </w:r>
-          </w:p>
-        </w:tc>
-      </w:tr>
-      <w:tr>
-        <w:tc>
-          <w:tcPr>
-            <w:tcW w:type="dxa" w:w="3216"/>
-            <w:shd w:fill="FFFFFF"/>
-            <w:tcMar>
-              <w:top w:w="80" w:type="dxa"/>
-              <w:bottom w:w="80" w:type="dxa"/>
-              <w:left w:w="100" w:type="dxa"/>
-              <w:right w:w="100" w:type="dxa"/>
-            </w:tcMar>
-          </w:tcPr>
-          <w:p>
-            <w:pPr>
-              <w:spacing w:after="0"/>
-            </w:pPr>
-            <w:r>
-              <w:rPr>
-                <w:rFonts w:ascii="Segoe UI" w:hAnsi="Segoe UI"/>
-                <w:b/>
-                <w:color w:val="1F2A33"/>
-                <w:sz w:val="19"/>
-              </w:rPr>
-              <w:t>GitHub Copilot</w:t>
-            </w:r>
-          </w:p>
-        </w:tc>
-        <w:tc>
-          <w:tcPr>
-            <w:tcW w:type="dxa" w:w="3216"/>
-            <w:shd w:fill="FFFFFF"/>
-            <w:tcMar>
-              <w:top w:w="80" w:type="dxa"/>
-              <w:bottom w:w="80" w:type="dxa"/>
-              <w:left w:w="100" w:type="dxa"/>
-              <w:right w:w="100" w:type="dxa"/>
-            </w:tcMar>
-          </w:tcPr>
-          <w:p>
-            <w:pPr>
-              <w:spacing w:after="0"/>
-            </w:pPr>
-            <w:r>
-              <w:rPr>
-                <w:rFonts w:ascii="Segoe UI" w:hAnsi="Segoe UI"/>
-                <w:color w:val="1F2A33"/>
-                <w:sz w:val="19"/>
-              </w:rPr>
-              <w:t>IDE Extension (Eclipse / VS Code)</w:t>
-            </w:r>
-          </w:p>
-        </w:tc>
-        <w:tc>
-          <w:tcPr>
-            <w:tcW w:type="dxa" w:w="3216"/>
-            <w:shd w:fill="FFFFFF"/>
-            <w:tcMar>
-              <w:top w:w="80" w:type="dxa"/>
-              <w:bottom w:w="80" w:type="dxa"/>
-              <w:left w:w="100" w:type="dxa"/>
-              <w:right w:w="100" w:type="dxa"/>
-            </w:tcMar>
-          </w:tcPr>
-          <w:p>
-            <w:pPr>
-              <w:spacing w:after="0"/>
-            </w:pPr>
-            <w:r>
-              <w:rPr>
-                <w:rFonts w:ascii="Segoe UI" w:hAnsi="Segoe UI"/>
-                <w:color w:val="1F2A33"/>
-                <w:sz w:val="19"/>
-              </w:rPr>
-              <w:t>Tự động gợi ý hoàn thiện dòng lệnh (IntelliSense enhancement), sinh các hàm getter/setter, constructor và mapping dữ liệu.</w:t>
-            </w:r>
-          </w:p>
-        </w:tc>
-      </w:tr>
-    </w:tbl>
-    <w:p>
-      <w:pPr>
-        <w:spacing w:after="160"/>
-      </w:pPr>
-    </w:p>
-    <w:p>
-      <w:pPr>
-        <w:keepNext/>
-        <w:spacing w:before="260" w:after="80"/>
-      </w:pPr>
-      <w:r>
-        <w:rPr>
-          <w:rFonts w:ascii="Segoe UI" w:hAnsi="Segoe UI"/>
-          <w:b/>
-          <w:color w:val="56788A"/>
-          <w:sz w:val="25"/>
-        </w:rPr>
-        <w:t>2.2. Quy trình làm việc phối hợp (AI Collaboration Workflow)</w:t>
+        <w:t>Quá trình phát triển 4 phân hệ được thực hiện theo mô hình lập trình cặp cùng Trí tuệ Nhân tạo (AI Pair-Programming):</w:t>
       </w:r>
     </w:p>
     <w:p>
@@ -1181,7 +623,7 @@
           <w:color w:val="1F2A33"/>
           <w:sz w:val="21"/>
         </w:rPr>
-        <w:t xml:space="preserve">Bước 1 - Phân tích yêu cầu &amp; Prompting: </w:t>
+        <w:t xml:space="preserve">Antigravity AI (Google DeepMind): </w:t>
       </w:r>
       <w:r>
         <w:rPr>
@@ -1189,7 +631,7 @@
           <w:color w:val="1F2A33"/>
           <w:sz w:val="21"/>
         </w:rPr>
-        <w:t>Sinh viên cung cấp đặc tả bài toán, ảnh chụp màn hình bị lỗi giao diện hoặc logic cần mở rộng.</w:t>
+        <w:t>Đóng vai trò kỹ sư UI/UX và chuyên gia giải thuật Swing. AI trực tiếp phân tích mã nguồn, dựng các component bo góc bằng Graphics2D khử răng cưa, thiết kế bộ icon vector 2D, tái cấu trúc layout chống xung đột và tối ưu hóa luồng dữ liệu liên module.</w:t>
       </w:r>
     </w:p>
     <w:p>
@@ -1205,7 +647,7 @@
           <w:color w:val="1F2A33"/>
           <w:sz w:val="21"/>
         </w:rPr>
-        <w:t xml:space="preserve">Bước 2 - AI Phản hồi giải pháp: </w:t>
+        <w:t xml:space="preserve">ChatGPT (GPT-4o) / Claude 3.5 Sonnet: </w:t>
       </w:r>
       <w:r>
         <w:rPr>
@@ -1213,7 +655,7 @@
           <w:color w:val="1F2A33"/>
           <w:sz w:val="21"/>
         </w:rPr>
-        <w:t>AI phân tích mô hình 3 lớp, đề xuất cấu trúc phân tầng (Entity, DAO, BUS, GUI) và sinh mã nguồn sạch.</w:t>
+        <w:t>Tham vấn chuẩn hóa cấu trúc thực thể y tế (Entity: ThuCung, DonThuoc, PhacDoDieuTri, GiaiDoanDieuTri, NhatKyTheoDoi) và đặc tả quy trình điều trị lâm sàng thú y chuẩn.</w:t>
       </w:r>
     </w:p>
     <w:p>
@@ -1229,7 +671,7 @@
           <w:color w:val="1F2A33"/>
           <w:sz w:val="21"/>
         </w:rPr>
-        <w:t xml:space="preserve">Bước 3 - Thẩm định mã nguồn (Review): </w:t>
+        <w:t xml:space="preserve">Sinh viên (Human-in-the-loop): </w:t>
       </w:r>
       <w:r>
         <w:rPr>
@@ -1237,7 +679,36 @@
           <w:color w:val="1F2A33"/>
           <w:sz w:val="21"/>
         </w:rPr>
-        <w:t>Sinh viên đọc lại mã nguồn, kiểm tra tính đóng gói, đối chiếu quy chuẩn dự án và đảm bảo an toàn luồng dữ liệu.</w:t>
+        <w:t>Giữ vai trò định hướng yêu cầu bài toán, thẩm định mã nguồn, kiểm tra an toàn dữ liệu, biên dịch trực tiếp trên môi trường thực tế (javac --release 21) và nghiệm thu giao diện tương tác.</w:t>
+      </w:r>
+    </w:p>
+    <w:p>
+      <w:pPr>
+        <w:keepNext/>
+        <w:spacing w:before="320" w:after="120"/>
+      </w:pPr>
+      <w:r>
+        <w:rPr>
+          <w:rFonts w:ascii="Segoe UI" w:hAnsi="Segoe UI"/>
+          <w:b/>
+          <w:color w:val="1E3442"/>
+          <w:sz w:val="29"/>
+        </w:rPr>
+        <w:t>3. NGUYÊN TẮC VÀ KỸ THUẬT PROMPT ENGINEERING ÁP DỤNG</w:t>
+      </w:r>
+    </w:p>
+    <w:p>
+      <w:pPr>
+        <w:spacing w:after="80" w:line="288" w:lineRule="auto"/>
+      </w:pPr>
+      <w:r>
+        <w:rPr>
+          <w:rFonts w:ascii="Segoe UI" w:hAnsi="Segoe UI"/>
+          <w:i w:val="0"/>
+          <w:color w:val="1F2A33"/>
+          <w:sz w:val="22"/>
+        </w:rPr>
+        <w:t>Nhóm đã đúc kết và áp dụng 4 nguyên tắc Prompt Engineering trọng tâm cho 4 chức năng:</w:t>
       </w:r>
     </w:p>
     <w:p>
@@ -1253,7 +724,7 @@
           <w:color w:val="1F2A33"/>
           <w:sz w:val="21"/>
         </w:rPr>
-        <w:t xml:space="preserve">Bước 4 - Biên dịch &amp; Kiểm thử thực tế: </w:t>
+        <w:t xml:space="preserve">1. Context-Driven Prompting: </w:t>
       </w:r>
       <w:r>
         <w:rPr>
@@ -1261,7 +732,7 @@
           <w:color w:val="1F2A33"/>
           <w:sz w:val="21"/>
         </w:rPr>
-        <w:t>Thực thi biên dịch `javac --release 21`, chạy `run.bat` để quan sát tương tác trực quan.</w:t>
+        <w:t>Mọi câu lệnh gửi cho AI đều cung cấp sẵn các file Entity, BUS liên quan và bảng mã màu Theme.java để mã nguồn sinh ra tương thích 100% với hệ thống có sẵn.</w:t>
       </w:r>
     </w:p>
     <w:p>
@@ -1277,7 +748,7 @@
           <w:color w:val="1F2A33"/>
           <w:sz w:val="21"/>
         </w:rPr>
-        <w:t xml:space="preserve">Bước 5 - Tinh chỉnh lặp (Iterative Refinement): </w:t>
+        <w:t xml:space="preserve">2. Constraint-Based Prompting: </w:t>
       </w:r>
       <w:r>
         <w:rPr>
@@ -1285,22 +756,85 @@
           <w:color w:val="1F2A33"/>
           <w:sz w:val="21"/>
         </w:rPr>
-        <w:t>Nếu phát hiện lệch vị trí hoặc thiếu sót nghiệp vụ, tiếp tục cung cấp phản hồi ngữ cảnh để AI xử lý tận gốc.</w:t>
+        <w:t>Yêu cầu không sử dụng thư viện Swing bên ngoài (FlatLaf...), toàn bộ bo góc và hiệu ứng đổ bóng phải vẽ bằng Graphics2D; biên dịch chuẩn Java 21; bảo toàn 100% mã nguồn hiện hữu.</w:t>
+      </w:r>
+    </w:p>
+    <w:p>
+      <w:pPr>
+        <w:pStyle w:val="ListBullet"/>
+        <w:spacing w:after="60" w:line="276" w:lineRule="auto"/>
+        <w:ind w:left="360"/>
+      </w:pPr>
+      <w:r>
+        <w:rPr>
+          <w:rFonts w:ascii="Segoe UI" w:hAnsi="Segoe UI"/>
+          <w:b/>
+          <w:color w:val="1F2A33"/>
+          <w:sz w:val="21"/>
+        </w:rPr>
+        <w:t xml:space="preserve">3. Multimodal Debugging: </w:t>
+      </w:r>
+      <w:r>
+        <w:rPr>
+          <w:rFonts w:ascii="Segoe UI" w:hAnsi="Segoe UI"/>
+          <w:color w:val="1F2A33"/>
+          <w:sz w:val="21"/>
+        </w:rPr>
+        <w:t>Khi gặp lỗi xung đột giao diện trong modal theo dõi diễn tiến (thành phần này đè lên thành phần kia), sinh viên chụp trực tiếp ảnh gửi cho AI để phân tích trực quan tọa độ lỗi.</w:t>
+      </w:r>
+    </w:p>
+    <w:p>
+      <w:pPr>
+        <w:pStyle w:val="ListBullet"/>
+        <w:spacing w:after="60" w:line="276" w:lineRule="auto"/>
+        <w:ind w:left="360"/>
+      </w:pPr>
+      <w:r>
+        <w:rPr>
+          <w:rFonts w:ascii="Segoe UI" w:hAnsi="Segoe UI"/>
+          <w:b/>
+          <w:color w:val="1F2A33"/>
+          <w:sz w:val="21"/>
+        </w:rPr>
+        <w:t xml:space="preserve">4. State Isolation Prompting: </w:t>
+      </w:r>
+      <w:r>
+        <w:rPr>
+          <w:rFonts w:ascii="Segoe UI" w:hAnsi="Segoe UI"/>
+          <w:color w:val="1F2A33"/>
+          <w:sz w:val="21"/>
+        </w:rPr>
+        <w:t>Yêu cầu AI tách bạch hoàn toàn giữa chế độ 'Thêm mới' (Form sạch) và chế độ 'Chỉnh sửa' (Form nạp dữ liệu cũ), khắc phục lỗi form tự điền sẵn dữ liệu cũ khi tạo mới.</w:t>
       </w:r>
     </w:p>
     <w:p>
       <w:pPr>
         <w:keepNext/>
-        <w:spacing w:before="360" w:after="120"/>
+        <w:spacing w:before="320" w:after="120"/>
       </w:pPr>
       <w:r>
         <w:rPr>
           <w:rFonts w:ascii="Segoe UI" w:hAnsi="Segoe UI"/>
           <w:b/>
           <w:color w:val="1E3442"/>
-          <w:sz w:val="30"/>
+          <w:sz w:val="29"/>
         </w:rPr>
-        <w:t>3. NGUYÊN TẮC VÀ KỸ THUẬT PROMPT ENGINEERING ĐÃ ÁP DỤNG</w:t>
+        <w:t>4. NHẬT KÝ CHI TIẾT TỪNG PHÂN HỆ CHUYÊN TRÁCH</w:t>
+      </w:r>
+    </w:p>
+    <w:p>
+      <w:pPr>
+        <w:keepNext/>
+        <w:spacing w:before="240" w:after="80"/>
+      </w:pPr>
+      <w:r>
+        <w:rPr>
+          <w:rFonts w:ascii="Segoe UI" w:hAnsi="Segoe UI"/>
+          <w:b/>
+          <w:color w:val="56788A"/>
+          <w:sz w:val="24"/>
+        </w:rPr>
+        <w:t>4.1. Phân hệ 1: Quản lý Thú cưng (Pet Management)</w:t>
       </w:r>
     </w:p>
     <w:p>
@@ -1310,26 +844,20 @@
       <w:r>
         <w:rPr>
           <w:rFonts w:ascii="Segoe UI" w:hAnsi="Segoe UI"/>
+          <w:b/>
+          <w:color w:val="1F2A33"/>
+          <w:sz w:val="22"/>
+        </w:rPr>
+        <w:t xml:space="preserve">Cấu trúc mã nguồn: </w:t>
+      </w:r>
+      <w:r>
+        <w:rPr>
+          <w:rFonts w:ascii="Segoe UI" w:hAnsi="Segoe UI"/>
           <w:i w:val="0"/>
           <w:color w:val="1F2A33"/>
           <w:sz w:val="22"/>
         </w:rPr>
-        <w:t>Để AI đóng góp mã nguồn chính xác cao và tránh sinh rác hay ảo giác, nhóm đã chuẩn hóa thành 5 kỹ thuật Prompt Engineering:</w:t>
-      </w:r>
-    </w:p>
-    <w:p>
-      <w:pPr>
-        <w:keepNext/>
-        <w:spacing w:before="260" w:after="80"/>
-      </w:pPr>
-      <w:r>
-        <w:rPr>
-          <w:rFonts w:ascii="Segoe UI" w:hAnsi="Segoe UI"/>
-          <w:b/>
-          <w:color w:val="56788A"/>
-          <w:sz w:val="25"/>
-        </w:rPr>
-        <w:t>3.1. Context-Driven Prompting (Cung cấp đầy đủ ngữ cảnh)</w:t>
+        <w:t>File mã nguồn phụ trách: ThuCung.java, ThuCungBUS.java, ThuCungDAO.java, ThuCungPanel.java.</w:t>
       </w:r>
     </w:p>
     <w:p>
@@ -1339,11 +867,50 @@
       <w:r>
         <w:rPr>
           <w:rFonts w:ascii="Segoe UI" w:hAnsi="Segoe UI"/>
+          <w:b/>
+          <w:color w:val="1F2A33"/>
+          <w:sz w:val="22"/>
+        </w:rPr>
+        <w:t xml:space="preserve">Bối cảnh: </w:t>
+      </w:r>
+      <w:r>
+        <w:rPr>
+          <w:rFonts w:ascii="Segoe UI" w:hAnsi="Segoe UI"/>
           <w:i w:val="0"/>
           <w:color w:val="1F2A33"/>
           <w:sz w:val="22"/>
         </w:rPr>
-        <w:t>Mọi câu lệnh gửi cho AI đều được cung cấp đầy đủ thông tin về phiên bản JDK, cấu trúc thư mục, các file liên quan và thư viện sẵn có:</w:t>
+        <w:t>Yêu cầu đặt ra:</w:t>
+      </w:r>
+    </w:p>
+    <w:p>
+      <w:pPr>
+        <w:pStyle w:val="ListBullet"/>
+        <w:spacing w:after="60" w:line="276" w:lineRule="auto"/>
+        <w:ind w:left="360"/>
+      </w:pPr>
+      <w:r>
+        <w:rPr>
+          <w:rFonts w:ascii="Segoe UI" w:hAnsi="Segoe UI"/>
+          <w:color w:val="1F2A33"/>
+          <w:sz w:val="21"/>
+        </w:rPr>
+        <w:t>Tạo giao diện quản lý bệnh nhân thú cưng chuẩn phòng khám: hiển thị avatar tròn, loài (Chó/Mèo), giống, cân nặng, số điện thoại chủ nuôi và tình trạng sức khỏe.</w:t>
+      </w:r>
+    </w:p>
+    <w:p>
+      <w:pPr>
+        <w:pStyle w:val="ListBullet"/>
+        <w:spacing w:after="60" w:line="276" w:lineRule="auto"/>
+        <w:ind w:left="360"/>
+      </w:pPr>
+      <w:r>
+        <w:rPr>
+          <w:rFonts w:ascii="Segoe UI" w:hAnsi="Segoe UI"/>
+          <w:color w:val="1F2A33"/>
+          <w:sz w:val="21"/>
+        </w:rPr>
+        <w:t>Cần có lối tắt giúp bác sĩ thao tác nhanh: từ hồ sơ thú cưng có thể mở ngay giao diện kê đơn thuốc hoặc phác đồ điều trị mà không phải nhập lại thông tin.</w:t>
       </w:r>
     </w:p>
     <w:tbl>
@@ -1362,10 +929,10 @@
             <w:tcW w:type="dxa" w:w="9648"/>
             <w:shd w:fill="F3F6F8"/>
             <w:tcMar>
-              <w:top w:w="140" w:type="dxa"/>
-              <w:bottom w:w="140" w:type="dxa"/>
-              <w:left w:w="200" w:type="dxa"/>
-              <w:right w:w="160" w:type="dxa"/>
+              <w:top w:w="120" w:type="dxa"/>
+              <w:bottom w:w="120" w:type="dxa"/>
+              <w:left w:w="180" w:type="dxa"/>
+              <w:right w:w="140" w:type="dxa"/>
             </w:tcMar>
             <w:tcBorders>
               <w:top w:val="none"/>
@@ -1385,7 +952,7 @@
                 <w:color w:val="1E3442"/>
                 <w:sz w:val="21"/>
               </w:rPr>
-              <w:t>Ví dụ Prompt ngữ cảnh mẫu:</w:t>
+              <w:t>Prompt của Sinh viên:</w:t>
               <w:br/>
             </w:r>
             <w:r>
@@ -1395,7 +962,7 @@
                 <w:color w:val="1F2A33"/>
                 <w:sz w:val="21"/>
               </w:rPr>
-              <w:t>"Dự án sử dụng Java 21, Swing thuần, không dùng thư viện bên ngoài trừ mssql-jdbc trong thư mục lib. Hãy đọc Entity/PhacDoDieuTri.java và bổ sung phương thức cập nhật tiến độ điều trị trong Bus/PhacDoBUS.java sao cho tự động chuyển trạng thái thành Hoàn thành khi đạt 100%."</w:t>
+              <w:t>"Hãy thiết kế màn hình ThuCungPanel.java với bảng danh sách có avatar tròn, huy hiệu loài và tình trạng sức khỏe. Đặc biệt, hãy bổ sung menu chuột phải (JPopupMenu) trên mỗi dòng thú cưng gồm 2 chức năng: 'Kê đơn thuốc' và 'Lập phác đồ điều trị', khi click sẽ gọi sang MainFrame để mở đúng form và điền sẵn thông tin thú cưng."</w:t>
             </w:r>
           </w:p>
         </w:tc>
@@ -1408,17 +975,25 @@
     </w:p>
     <w:p>
       <w:pPr>
-        <w:keepNext/>
-        <w:spacing w:before="260" w:after="80"/>
+        <w:spacing w:after="80" w:line="288" w:lineRule="auto"/>
       </w:pPr>
       <w:r>
         <w:rPr>
           <w:rFonts w:ascii="Segoe UI" w:hAnsi="Segoe UI"/>
           <w:b/>
-          <w:color w:val="56788A"/>
-          <w:sz w:val="25"/>
+          <w:color w:val="1F2A33"/>
+          <w:sz w:val="22"/>
         </w:rPr>
-        <w:t>3.2. Constraint-Based Prompting (Ràng buộc kỹ thuật khắt khe)</w:t>
+        <w:t xml:space="preserve">Kết quả thực hiện: </w:t>
+      </w:r>
+      <w:r>
+        <w:rPr>
+          <w:rFonts w:ascii="Segoe UI" w:hAnsi="Segoe UI"/>
+          <w:i w:val="0"/>
+          <w:color w:val="1F2A33"/>
+          <w:sz w:val="22"/>
+        </w:rPr>
+        <w:t>Giải pháp AI cung cấp:</w:t>
       </w:r>
     </w:p>
     <w:p>
@@ -1430,19 +1005,10 @@
       <w:r>
         <w:rPr>
           <w:rFonts w:ascii="Segoe UI" w:hAnsi="Segoe UI"/>
-          <w:b/>
           <w:color w:val="1F2A33"/>
           <w:sz w:val="21"/>
         </w:rPr>
-        <w:t xml:space="preserve">Ràng buộc 1 - Thư viện chuẩn: </w:t>
-      </w:r>
-      <w:r>
-        <w:rPr>
-          <w:rFonts w:ascii="Segoe UI" w:hAnsi="Segoe UI"/>
-          <w:color w:val="1F2A33"/>
-          <w:sz w:val="21"/>
-        </w:rPr>
-        <w:t>Không dùng thư viện Swing bên ngoài (FlatLaf, JGoodies), tự dựng các component bo góc bằng Graphics2D.</w:t>
+        <w:t>Xây dựng PetAvatar tự động render ảnh bo tròn; SpeciesBadge và HealthBadge hiển thị trạng thái sinh động (Khỏe mạnh, Đang điều trị, Cần theo dõi).</w:t>
       </w:r>
     </w:p>
     <w:p>
@@ -1454,160 +1020,25 @@
       <w:r>
         <w:rPr>
           <w:rFonts w:ascii="Segoe UI" w:hAnsi="Segoe UI"/>
-          <w:b/>
           <w:color w:val="1F2A33"/>
           <w:sz w:val="21"/>
         </w:rPr>
-        <w:t xml:space="preserve">Ràng buộc 2 - Phiên bản Java: </w:t>
-      </w:r>
-      <w:r>
-        <w:rPr>
-          <w:rFonts w:ascii="Segoe UI" w:hAnsi="Segoe UI"/>
-          <w:color w:val="1F2A33"/>
-          <w:sz w:val="21"/>
-        </w:rPr>
-        <w:t>Bắt buộc biên dịch với cờ `--release 21` để tương thích chuẩn với Java Runtime của Eclipse trên máy sinh viên.</w:t>
-      </w:r>
-    </w:p>
-    <w:p>
-      <w:pPr>
-        <w:pStyle w:val="ListBullet"/>
-        <w:spacing w:after="60" w:line="276" w:lineRule="auto"/>
-        <w:ind w:left="360"/>
-      </w:pPr>
-      <w:r>
-        <w:rPr>
-          <w:rFonts w:ascii="Segoe UI" w:hAnsi="Segoe UI"/>
-          <w:b/>
-          <w:color w:val="1F2A33"/>
-          <w:sz w:val="21"/>
-        </w:rPr>
-        <w:t xml:space="preserve">Ràng buộc 3 - Bảo toàn mã: </w:t>
-      </w:r>
-      <w:r>
-        <w:rPr>
-          <w:rFonts w:ascii="Segoe UI" w:hAnsi="Segoe UI"/>
-          <w:color w:val="1F2A33"/>
-          <w:sz w:val="21"/>
-        </w:rPr>
-        <w:t>Bảo toàn 100% chú thích và hàm hiện có, không tự ý xóa bỏ mã nguồn không liên quan.</w:t>
+        <w:t>Bổ sung menu chuột phải kết nối thông minh sang MainFrame (moKeDonChoThuCung, moPhacDoChoThuCung), giúp bác sĩ thao tác liền mạch chỉ với 1 cú click chuột.</w:t>
       </w:r>
     </w:p>
     <w:p>
       <w:pPr>
         <w:keepNext/>
-        <w:spacing w:before="260" w:after="80"/>
+        <w:spacing w:before="240" w:after="80"/>
       </w:pPr>
       <w:r>
         <w:rPr>
           <w:rFonts w:ascii="Segoe UI" w:hAnsi="Segoe UI"/>
           <w:b/>
           <w:color w:val="56788A"/>
-          <w:sz w:val="25"/>
+          <w:sz w:val="24"/>
         </w:rPr>
-        <w:t>3.3. Multimodal Prompting (Tải ảnh chụp giao diện lỗi)</w:t>
-      </w:r>
-    </w:p>
-    <w:p>
-      <w:pPr>
-        <w:spacing w:after="80" w:line="288" w:lineRule="auto"/>
-      </w:pPr>
-      <w:r>
-        <w:rPr>
-          <w:rFonts w:ascii="Segoe UI" w:hAnsi="Segoe UI"/>
-          <w:i w:val="0"/>
-          <w:color w:val="1F2A33"/>
-          <w:sz w:val="22"/>
-        </w:rPr>
-        <w:t>Khi modal 'Theo dõi diễn tiến điều trị' bị lỗi hiển thị đè chữ nghiêm trọng, sinh viên đã chụp ảnh trực tiếp cửa sổ ứng dụng gửi cho AI. AI phân tích hình ảnh và nhận diện chính xác dòng highlight xanh của JList đang che lấp toàn bộ nhãn 'Chi tiết ghi nhận', từ đó phát hiện xung đột giữa GridLayout(4,2) và BorderLayout.</w:t>
-      </w:r>
-    </w:p>
-    <w:p>
-      <w:pPr>
-        <w:keepNext/>
-        <w:spacing w:before="260" w:after="80"/>
-      </w:pPr>
-      <w:r>
-        <w:rPr>
-          <w:rFonts w:ascii="Segoe UI" w:hAnsi="Segoe UI"/>
-          <w:b/>
-          <w:color w:val="56788A"/>
-          <w:sz w:val="25"/>
-        </w:rPr>
-        <w:t>3.4. Role-Based Prompting (Định hình vai trò chuyên gia)</w:t>
-      </w:r>
-    </w:p>
-    <w:p>
-      <w:pPr>
-        <w:spacing w:after="80" w:line="288" w:lineRule="auto"/>
-      </w:pPr>
-      <w:r>
-        <w:rPr>
-          <w:rFonts w:ascii="Segoe UI" w:hAnsi="Segoe UI"/>
-          <w:i w:val="0"/>
-          <w:color w:val="1F2A33"/>
-          <w:sz w:val="22"/>
-        </w:rPr>
-        <w:t>Yêu cầu AI đóng vai 'Chuyên gia Kiến trúc Giao diện UI/UX Swing' để thiết lập hệ thống bảng màu (Theme.java), khoảng cách đệm (EmptyBorder), bo góc (Arc), và căn chỉnh lề chuyên nghiệp chuẩn SaaS.</w:t>
-      </w:r>
-    </w:p>
-    <w:p>
-      <w:pPr>
-        <w:keepNext/>
-        <w:spacing w:before="260" w:after="80"/>
-      </w:pPr>
-      <w:r>
-        <w:rPr>
-          <w:rFonts w:ascii="Segoe UI" w:hAnsi="Segoe UI"/>
-          <w:b/>
-          <w:color w:val="56788A"/>
-          <w:sz w:val="25"/>
-        </w:rPr>
-        <w:t>3.5. Atomic Commit Decomposition Prompting</w:t>
-      </w:r>
-    </w:p>
-    <w:p>
-      <w:pPr>
-        <w:spacing w:after="80" w:line="288" w:lineRule="auto"/>
-      </w:pPr>
-      <w:r>
-        <w:rPr>
-          <w:rFonts w:ascii="Segoe UI" w:hAnsi="Segoe UI"/>
-          <w:i w:val="0"/>
-          <w:color w:val="1F2A33"/>
-          <w:sz w:val="22"/>
-        </w:rPr>
-        <w:t>Sau khi hoàn thiện cụm chức năng lớn, sinh viên yêu cầu AI phân tích git working tree và bóc tách thành từng commit nhỏ (atomic commits) riêng biệt theo chuẩn Conventional Commits (`feat(...)`, `fix(...)`), giúp lịch sử Git rõ ràng và chuyên nghiệp khi nộp đồ án.</w:t>
-      </w:r>
-    </w:p>
-    <w:p>
-      <w:pPr>
-        <w:keepNext/>
-        <w:spacing w:before="360" w:after="120"/>
-      </w:pPr>
-      <w:r>
-        <w:rPr>
-          <w:rFonts w:ascii="Segoe UI" w:hAnsi="Segoe UI"/>
-          <w:b/>
-          <w:color w:val="1E3442"/>
-          <w:sz w:val="30"/>
-        </w:rPr>
-        <w:t>4. NHẬT KÝ CHI TIẾT CÁC PHIÊN LÀM VIỆC VỚI AI THEO GIAI ĐOẠN</w:t>
-      </w:r>
-    </w:p>
-    <w:p>
-      <w:pPr>
-        <w:keepNext/>
-        <w:spacing w:before="260" w:after="80"/>
-      </w:pPr>
-      <w:r>
-        <w:rPr>
-          <w:rFonts w:ascii="Segoe UI" w:hAnsi="Segoe UI"/>
-          <w:b/>
-          <w:color w:val="56788A"/>
-          <w:sz w:val="25"/>
-        </w:rPr>
-        <w:t>Giai đoạn 1: Khởi tạo kiến trúc, CSDL &amp; Design System (05/10 - 11/10/2026)</w:t>
+        <w:t>4.2. Phân hệ 2: Quản lý Kho hàng &amp; Lịch sử Nhập - Xuất (Inventory Management)</w:t>
       </w:r>
     </w:p>
     <w:p>
@@ -1621,7 +1052,7 @@
           <w:color w:val="1F2A33"/>
           <w:sz w:val="22"/>
         </w:rPr>
-        <w:t xml:space="preserve">Mục tiêu: </w:t>
+        <w:t xml:space="preserve">Cấu trúc mã nguồn: </w:t>
       </w:r>
       <w:r>
         <w:rPr>
@@ -1630,94 +1061,7 @@
           <w:color w:val="1F2A33"/>
           <w:sz w:val="22"/>
         </w:rPr>
-        <w:t>Xây dựng khung phân tầng 3 lớp (3-Tier), tạo CSDL PetCare.sql và hệ thống giao diện phẳng hiện đại.</w:t>
-      </w:r>
-    </w:p>
-    <w:p>
-      <w:pPr>
-        <w:pStyle w:val="ListBullet"/>
-        <w:spacing w:after="60" w:line="276" w:lineRule="auto"/>
-        <w:ind w:left="360"/>
-      </w:pPr>
-      <w:r>
-        <w:rPr>
-          <w:rFonts w:ascii="Segoe UI" w:hAnsi="Segoe UI"/>
-          <w:b/>
-          <w:color w:val="1F2A33"/>
-          <w:sz w:val="21"/>
-        </w:rPr>
-        <w:t xml:space="preserve">Giải pháp AI: </w:t>
-      </w:r>
-      <w:r>
-        <w:rPr>
-          <w:rFonts w:ascii="Segoe UI" w:hAnsi="Segoe UI"/>
-          <w:color w:val="1F2A33"/>
-          <w:sz w:val="21"/>
-        </w:rPr>
-        <w:t>Tạo class Theme.java: Quy định bảng màu thương hiệu (ACCENT #56788A, DARK #1E3442, BG #F3F6F8, ROW_LINE #E9EDF0) và các màu huy hiệu (Badge) trạng thái.</w:t>
-      </w:r>
-    </w:p>
-    <w:p>
-      <w:pPr>
-        <w:pStyle w:val="ListBullet"/>
-        <w:spacing w:after="60" w:line="276" w:lineRule="auto"/>
-        <w:ind w:left="360"/>
-      </w:pPr>
-      <w:r>
-        <w:rPr>
-          <w:rFonts w:ascii="Segoe UI" w:hAnsi="Segoe UI"/>
-          <w:b/>
-          <w:color w:val="1F2A33"/>
-          <w:sz w:val="21"/>
-        </w:rPr>
-        <w:t xml:space="preserve">Giải pháp AI: </w:t>
-      </w:r>
-      <w:r>
-        <w:rPr>
-          <w:rFonts w:ascii="Segoe UI" w:hAnsi="Segoe UI"/>
-          <w:color w:val="1F2A33"/>
-          <w:sz w:val="21"/>
-        </w:rPr>
-        <w:t>Tạo RoundedButton.java và RoundedPanel.java: Tự vẽ bo góc mượt mà bằng Graphics2D khử răng cưa (Antialiasing), hỗ trợ hover animation.</w:t>
-      </w:r>
-    </w:p>
-    <w:p>
-      <w:pPr>
-        <w:pStyle w:val="ListBullet"/>
-        <w:spacing w:after="60" w:line="276" w:lineRule="auto"/>
-        <w:ind w:left="360"/>
-      </w:pPr>
-      <w:r>
-        <w:rPr>
-          <w:rFonts w:ascii="Segoe UI" w:hAnsi="Segoe UI"/>
-          <w:b/>
-          <w:color w:val="1F2A33"/>
-          <w:sz w:val="21"/>
-        </w:rPr>
-        <w:t xml:space="preserve">Giải pháp AI: </w:t>
-      </w:r>
-      <w:r>
-        <w:rPr>
-          <w:rFonts w:ascii="Segoe UI" w:hAnsi="Segoe UI"/>
-          <w:color w:val="1F2A33"/>
-          <w:sz w:val="21"/>
-        </w:rPr>
-        <w:t>Tạo Icons.java: Tự vẽ hơn 25 biểu tượng vector bằng mã lệnh Java 2D (Path2D, Line2D, RoundRectangle2D), loại bỏ hoàn toàn việc phụ thuộc file ảnh PNG bên ngoài.</w:t>
-      </w:r>
-    </w:p>
-    <w:p>
-      <w:pPr>
-        <w:keepNext/>
-        <w:spacing w:before="260" w:after="80"/>
-      </w:pPr>
-      <w:r>
-        <w:rPr>
-          <w:rFonts w:ascii="Segoe UI" w:hAnsi="Segoe UI"/>
-          <w:b/>
-          <w:color w:val="56788A"/>
-          <w:sz w:val="25"/>
-        </w:rPr>
-        <w:t>Giai đoạn 2: Quản lý Thú cưng &amp; Lưu trú Lồng chuồng (11/10 - 16/10/2026)</w:t>
+        <w:t>File mã nguồn phụ trách: SanPham.java, PhieuKho.java, KhoHangBUS.java, PhieuKhoBUS.java, KhoHangPanel.java, LichSuNhapXuatPanel.java, CalendarPicker.java.</w:t>
       </w:r>
     </w:p>
     <w:p>
@@ -1731,7 +1075,7 @@
           <w:color w:val="1F2A33"/>
           <w:sz w:val="22"/>
         </w:rPr>
-        <w:t xml:space="preserve">Mục tiêu: </w:t>
+        <w:t xml:space="preserve">Bối cảnh: </w:t>
       </w:r>
       <w:r>
         <w:rPr>
@@ -1740,7 +1084,7 @@
           <w:color w:val="1F2A33"/>
           <w:sz w:val="22"/>
         </w:rPr>
-        <w:t>Quản lý thông tin bệnh nhân thú cưng, ảnh đại diện, tiền sử bệnh án và hệ thống buồng lưu trú.</w:t>
+        <w:t>Yêu cầu đặt ra:</w:t>
       </w:r>
     </w:p>
     <w:p>
@@ -1752,19 +1096,10 @@
       <w:r>
         <w:rPr>
           <w:rFonts w:ascii="Segoe UI" w:hAnsi="Segoe UI"/>
-          <w:b/>
           <w:color w:val="1F2A33"/>
           <w:sz w:val="21"/>
         </w:rPr>
-        <w:t xml:space="preserve">Giải pháp AI: </w:t>
-      </w:r>
-      <w:r>
-        <w:rPr>
-          <w:rFonts w:ascii="Segoe UI" w:hAnsi="Segoe UI"/>
-          <w:color w:val="1F2A33"/>
-          <w:sz w:val="21"/>
-        </w:rPr>
-        <w:t>Tạo ThuCung.java, ThuCungBUS.java, ThuCungDAO.java với đầy đủ thuộc tính y tế (loài, giống, cân nặng, tiền sử bệnh án, chủ nuôi).</w:t>
+        <w:t>Theo dõi kho thuốc thú y, vaccine, dinh dưỡng và dụng cụ y tế; tự động cảnh báo thuốc hết hạn hoặc tồn kho thấp (&lt; 10 sản phẩm).</w:t>
       </w:r>
     </w:p>
     <w:p>
@@ -1776,19 +1111,10 @@
       <w:r>
         <w:rPr>
           <w:rFonts w:ascii="Segoe UI" w:hAnsi="Segoe UI"/>
-          <w:b/>
           <w:color w:val="1F2A33"/>
           <w:sz w:val="21"/>
         </w:rPr>
-        <w:t xml:space="preserve">Giải pháp AI: </w:t>
-      </w:r>
-      <w:r>
-        <w:rPr>
-          <w:rFonts w:ascii="Segoe UI" w:hAnsi="Segoe UI"/>
-          <w:color w:val="1F2A33"/>
-          <w:sz w:val="21"/>
-        </w:rPr>
-        <w:t>Xây dựng AvatarUploadBox: Khung ảnh bo tròn cho phép tải và lưu trữ ảnh thú cưng.</w:t>
+        <w:t>Khi bác sĩ xuất đơn thuốc, số lượng thuốc trong kho phải tự động trừ và cập nhật trạng thái nếu hết hàng ('Tạm hết hàng').</w:t>
       </w:r>
     </w:p>
     <w:p>
@@ -1800,34 +1126,211 @@
       <w:r>
         <w:rPr>
           <w:rFonts w:ascii="Segoe UI" w:hAnsi="Segoe UI"/>
-          <w:b/>
           <w:color w:val="1F2A33"/>
           <w:sz w:val="21"/>
         </w:rPr>
-        <w:t xml:space="preserve">Giải pháp AI: </w:t>
+        <w:t>Xây dựng bộ chọn ngày cuộn lịch mà không được dùng thư viện bên ngoài.</w:t>
       </w:r>
+    </w:p>
+    <w:tbl>
+      <w:tblPr>
+        <w:tblW w:type="auto" w:w="0"/>
+        <w:jc w:val="center"/>
+        <w:tblLayout w:type="fixed"/>
+        <w:tblLook w:firstColumn="1" w:firstRow="1" w:lastColumn="0" w:lastRow="0" w:noHBand="0" w:noVBand="1" w:val="04A0"/>
+      </w:tblPr>
+      <w:tblGrid>
+        <w:gridCol w:w="9360"/>
+      </w:tblGrid>
+      <w:tr>
+        <w:tc>
+          <w:tcPr>
+            <w:tcW w:type="dxa" w:w="9648"/>
+            <w:shd w:fill="F3F6F8"/>
+            <w:tcMar>
+              <w:top w:w="120" w:type="dxa"/>
+              <w:bottom w:w="120" w:type="dxa"/>
+              <w:left w:w="180" w:type="dxa"/>
+              <w:right w:w="140" w:type="dxa"/>
+            </w:tcMar>
+            <w:tcBorders>
+              <w:top w:val="none"/>
+              <w:left w:val="single" w:sz="36" w:space="0" w:color="56788A"/>
+              <w:bottom w:val="none"/>
+              <w:right w:val="none"/>
+            </w:tcBorders>
+          </w:tcPr>
+          <w:p>
+            <w:pPr>
+              <w:spacing w:after="0" w:line="288" w:lineRule="auto"/>
+            </w:pPr>
+            <w:r>
+              <w:rPr>
+                <w:rFonts w:ascii="Segoe UI" w:hAnsi="Segoe UI"/>
+                <w:b/>
+                <w:color w:val="1E3442"/>
+                <w:sz w:val="21"/>
+              </w:rPr>
+              <w:t>Prompt của Sinh viên:</w:t>
+              <w:br/>
+            </w:r>
+            <w:r>
+              <w:rPr>
+                <w:rFonts w:ascii="Segoe UI" w:hAnsi="Segoe UI"/>
+                <w:i/>
+                <w:color w:val="1F2A33"/>
+                <w:sz w:val="21"/>
+              </w:rPr>
+              <w:t>"Trong KhoHangBUS.java, hãy bổ sung phương thức xuatKho(String maSKU, int soLuongXuat) kiểm tra tồn kho, tự động đổi trạng thái sang 'Tạm hết hàng' nếu về 0. Đồng thời xây dựng cơ chế listener để khi xuất kho thì KhoHangPanel tự refresh lại."</w:t>
+            </w:r>
+          </w:p>
+        </w:tc>
+      </w:tr>
+    </w:tbl>
+    <w:p>
+      <w:pPr>
+        <w:spacing w:after="80"/>
+      </w:pPr>
+    </w:p>
+    <w:p>
+      <w:pPr>
+        <w:spacing w:after="80" w:line="288" w:lineRule="auto"/>
+      </w:pPr>
+      <w:r>
+        <w:rPr>
+          <w:rFonts w:ascii="Segoe UI" w:hAnsi="Segoe UI"/>
+          <w:b/>
+          <w:color w:val="1F2A33"/>
+          <w:sz w:val="22"/>
+        </w:rPr>
+        <w:t xml:space="preserve">Kết quả thực hiện: </w:t>
+      </w:r>
+      <w:r>
+        <w:rPr>
+          <w:rFonts w:ascii="Segoe UI" w:hAnsi="Segoe UI"/>
+          <w:i w:val="0"/>
+          <w:color w:val="1F2A33"/>
+          <w:sz w:val="22"/>
+        </w:rPr>
+        <w:t>Giải pháp AI cung cấp:</w:t>
+      </w:r>
+    </w:p>
+    <w:tbl>
+      <w:tblPr>
+        <w:tblW w:type="auto" w:w="0"/>
+        <w:jc w:val="center"/>
+        <w:tblLayout w:type="fixed"/>
+        <w:tblLook w:firstColumn="1" w:firstRow="1" w:lastColumn="0" w:lastRow="0" w:noHBand="0" w:noVBand="1" w:val="04A0"/>
+      </w:tblPr>
+      <w:tblGrid>
+        <w:gridCol w:w="9360"/>
+      </w:tblGrid>
+      <w:tr>
+        <w:tc>
+          <w:tcPr>
+            <w:tcW w:type="dxa" w:w="9648"/>
+            <w:shd w:fill="F1F5F9"/>
+            <w:tcMar>
+              <w:top w:w="80" w:type="dxa"/>
+              <w:bottom w:w="80" w:type="dxa"/>
+              <w:left w:w="120" w:type="dxa"/>
+              <w:right w:w="120" w:type="dxa"/>
+            </w:tcMar>
+            <w:tcBorders>
+              <w:top w:val="single" w:sz="4" w:space="0" w:color="DDE3E8"/>
+              <w:left w:val="single" w:sz="4" w:space="0" w:color="DDE3E8"/>
+              <w:bottom w:val="single" w:sz="4" w:space="0" w:color="DDE3E8"/>
+              <w:right w:val="single" w:sz="4" w:space="0" w:color="DDE3E8"/>
+            </w:tcBorders>
+          </w:tcPr>
+          <w:p>
+            <w:pPr>
+              <w:spacing w:after="0" w:line="276" w:lineRule="auto"/>
+            </w:pPr>
+            <w:r>
+              <w:rPr>
+                <w:rFonts w:ascii="Consolas" w:hAnsi="Consolas"/>
+                <w:color w:val="0F172A"/>
+                <w:sz w:val="19"/>
+              </w:rPr>
+              <w:t>public boolean xuatKho(String maSKU, int soLuongXuat) {</w:t>
+              <w:br/>
+              <w:t xml:space="preserve">    if (maSKU == null || maSKU.trim().isEmpty() || soLuongXuat &lt;= 0) return false;</w:t>
+              <w:br/>
+              <w:t xml:space="preserve">    for (SanPham sp : ds) {</w:t>
+              <w:br/>
+              <w:t xml:space="preserve">        if (sp.getMaSKU().equalsIgnoreCase(maSKU.trim())) {</w:t>
+              <w:br/>
+              <w:t xml:space="preserve">            int tonMoi = Math.max(0, sp.getSoLuongTon() - soLuongXuat);</w:t>
+              <w:br/>
+              <w:t xml:space="preserve">            sp.setSoLuongTon(tonMoi);</w:t>
+              <w:br/>
+              <w:t xml:space="preserve">            if (tonMoi == 0) sp.setTrangThai("Tạm hết hàng");</w:t>
+              <w:br/>
+              <w:t xml:space="preserve">            notifyListeners();</w:t>
+              <w:br/>
+              <w:t xml:space="preserve">            return true;</w:t>
+              <w:br/>
+              <w:t xml:space="preserve">        }</w:t>
+              <w:br/>
+              <w:t xml:space="preserve">    }</w:t>
+              <w:br/>
+              <w:t xml:space="preserve">    return false;</w:t>
+              <w:br/>
+              <w:t>}</w:t>
+            </w:r>
+          </w:p>
+        </w:tc>
+      </w:tr>
+    </w:tbl>
+    <w:p>
+      <w:pPr>
+        <w:spacing w:after="80"/>
+      </w:pPr>
+    </w:p>
+    <w:p>
+      <w:pPr>
+        <w:pStyle w:val="ListBullet"/>
+        <w:spacing w:after="60" w:line="276" w:lineRule="auto"/>
+        <w:ind w:left="360"/>
+      </w:pPr>
       <w:r>
         <w:rPr>
           <w:rFonts w:ascii="Segoe UI" w:hAnsi="Segoe UI"/>
           <w:color w:val="1F2A33"/>
           <w:sz w:val="21"/>
         </w:rPr>
-        <w:t>Xây dựng phân hệ LongChuongPanel, DialogDatChuong, DialogChuyenChuong hỗ trợ quản lý thú cưng nằm viện điều trị.</w:t>
+        <w:t>Cài đặt Observer Pattern (addListener / notifyListeners) giúp các panel khác nhau (Đơn thuốc, Kho hàng, Hóa đơn) luôn đồng bộ dữ liệu thời gian thực.</w:t>
+      </w:r>
+    </w:p>
+    <w:p>
+      <w:pPr>
+        <w:pStyle w:val="ListBullet"/>
+        <w:spacing w:after="60" w:line="276" w:lineRule="auto"/>
+        <w:ind w:left="360"/>
+      </w:pPr>
+      <w:r>
+        <w:rPr>
+          <w:rFonts w:ascii="Segoe UI" w:hAnsi="Segoe UI"/>
+          <w:color w:val="1F2A33"/>
+          <w:sz w:val="21"/>
+        </w:rPr>
+        <w:t>Xây dựng CalendarPicker.java: Pop-up lịch động tùy chỉnh chọn ngày tháng trực quan bằng Swing thuần.</w:t>
       </w:r>
     </w:p>
     <w:p>
       <w:pPr>
         <w:keepNext/>
-        <w:spacing w:before="260" w:after="80"/>
+        <w:spacing w:before="240" w:after="80"/>
       </w:pPr>
       <w:r>
         <w:rPr>
           <w:rFonts w:ascii="Segoe UI" w:hAnsi="Segoe UI"/>
           <w:b/>
           <w:color w:val="56788A"/>
-          <w:sz w:val="25"/>
+          <w:sz w:val="24"/>
         </w:rPr>
-        <w:t>Giai đoạn 3: Quản lý Kho hàng &amp; Lịch sử Nhập - Xuất (11/10 - 20/10/2026)</w:t>
+        <w:t>4.3. Phân hệ 3: Quản lý Đơn thuốc &amp; Dược phẩm (Prescription Management)</w:t>
       </w:r>
     </w:p>
     <w:p>
@@ -1841,7 +1344,7 @@
           <w:color w:val="1F2A33"/>
           <w:sz w:val="22"/>
         </w:rPr>
-        <w:t xml:space="preserve">Mục tiêu: </w:t>
+        <w:t xml:space="preserve">Cấu trúc mã nguồn: </w:t>
       </w:r>
       <w:r>
         <w:rPr>
@@ -1850,94 +1353,7 @@
           <w:color w:val="1F2A33"/>
           <w:sz w:val="22"/>
         </w:rPr>
-        <w:t>Theo dõi tồn kho thuốc, cảnh báo hết hàng/hết hạn, lập phiếu nhập xuất kho.</w:t>
-      </w:r>
-    </w:p>
-    <w:p>
-      <w:pPr>
-        <w:pStyle w:val="ListBullet"/>
-        <w:spacing w:after="60" w:line="276" w:lineRule="auto"/>
-        <w:ind w:left="360"/>
-      </w:pPr>
-      <w:r>
-        <w:rPr>
-          <w:rFonts w:ascii="Segoe UI" w:hAnsi="Segoe UI"/>
-          <w:b/>
-          <w:color w:val="1F2A33"/>
-          <w:sz w:val="21"/>
-        </w:rPr>
-        <w:t xml:space="preserve">Giải pháp AI: </w:t>
-      </w:r>
-      <w:r>
-        <w:rPr>
-          <w:rFonts w:ascii="Segoe UI" w:hAnsi="Segoe UI"/>
-          <w:color w:val="1F2A33"/>
-          <w:sz w:val="21"/>
-        </w:rPr>
-        <w:t>Xây dựng CalendarPicker.java: Pop-up lịch động tùy chỉnh cho phép chọn ngày tháng trực quan không cần thư viện ngoài.</w:t>
-      </w:r>
-    </w:p>
-    <w:p>
-      <w:pPr>
-        <w:pStyle w:val="ListBullet"/>
-        <w:spacing w:after="60" w:line="276" w:lineRule="auto"/>
-        <w:ind w:left="360"/>
-      </w:pPr>
-      <w:r>
-        <w:rPr>
-          <w:rFonts w:ascii="Segoe UI" w:hAnsi="Segoe UI"/>
-          <w:b/>
-          <w:color w:val="1F2A33"/>
-          <w:sz w:val="21"/>
-        </w:rPr>
-        <w:t xml:space="preserve">Giải pháp AI: </w:t>
-      </w:r>
-      <w:r>
-        <w:rPr>
-          <w:rFonts w:ascii="Segoe UI" w:hAnsi="Segoe UI"/>
-          <w:color w:val="1F2A33"/>
-          <w:sz w:val="21"/>
-        </w:rPr>
-        <w:t>Bổ sung phương thức xuatKho(String maSKU, int soLuong) tự động kiểm tra và trừ tồn kho.</w:t>
-      </w:r>
-    </w:p>
-    <w:p>
-      <w:pPr>
-        <w:pStyle w:val="ListBullet"/>
-        <w:spacing w:after="60" w:line="276" w:lineRule="auto"/>
-        <w:ind w:left="360"/>
-      </w:pPr>
-      <w:r>
-        <w:rPr>
-          <w:rFonts w:ascii="Segoe UI" w:hAnsi="Segoe UI"/>
-          <w:b/>
-          <w:color w:val="1F2A33"/>
-          <w:sz w:val="21"/>
-        </w:rPr>
-        <w:t xml:space="preserve">Giải pháp AI: </w:t>
-      </w:r>
-      <w:r>
-        <w:rPr>
-          <w:rFonts w:ascii="Segoe UI" w:hAnsi="Segoe UI"/>
-          <w:color w:val="1F2A33"/>
-          <w:sz w:val="21"/>
-        </w:rPr>
-        <w:t>Cài đặt Observer Pattern (addListener / notifyListeners) giúp giao diện kho hàng tự động làm mới ngay khi có đơn thuốc xuất kho.</w:t>
-      </w:r>
-    </w:p>
-    <w:p>
-      <w:pPr>
-        <w:keepNext/>
-        <w:spacing w:before="260" w:after="80"/>
-      </w:pPr>
-      <w:r>
-        <w:rPr>
-          <w:rFonts w:ascii="Segoe UI" w:hAnsi="Segoe UI"/>
-          <w:b/>
-          <w:color w:val="56788A"/>
-          <w:sz w:val="25"/>
-        </w:rPr>
-        <w:t>Giai đoạn 4: Quản lý Lịch hẹn 5 chế độ vận hành (21/10 - 25/10/2026)</w:t>
+        <w:t>File mã nguồn phụ trách: DonThuoc.java, ChiTietDonThuoc.java, DonThuocBUS.java, DonThuocPanel.java.</w:t>
       </w:r>
     </w:p>
     <w:p>
@@ -1951,7 +1367,7 @@
           <w:color w:val="1F2A33"/>
           <w:sz w:val="22"/>
         </w:rPr>
-        <w:t xml:space="preserve">Mục tiêu: </w:t>
+        <w:t xml:space="preserve">Bối cảnh: </w:t>
       </w:r>
       <w:r>
         <w:rPr>
@@ -1960,7 +1376,7 @@
           <w:color w:val="1F2A33"/>
           <w:sz w:val="22"/>
         </w:rPr>
-        <w:t>Xây dựng phân hệ quản lý lịch hẹn khám bệnh, tiêm phòng, phẫu thuật, spa.</w:t>
+        <w:t>Yêu cầu đặt ra:</w:t>
       </w:r>
     </w:p>
     <w:p>
@@ -1972,19 +1388,10 @@
       <w:r>
         <w:rPr>
           <w:rFonts w:ascii="Segoe UI" w:hAnsi="Segoe UI"/>
-          <w:b/>
           <w:color w:val="1F2A33"/>
           <w:sz w:val="21"/>
         </w:rPr>
-        <w:t xml:space="preserve">Giải pháp AI: </w:t>
-      </w:r>
-      <w:r>
-        <w:rPr>
-          <w:rFonts w:ascii="Segoe UI" w:hAnsi="Segoe UI"/>
-          <w:color w:val="1F2A33"/>
-          <w:sz w:val="21"/>
-        </w:rPr>
-        <w:t>Enum Mode với 5 chế độ: HO_SO (tra cứu hồ sơ hẹn), QUAN_LY (điều phối cuộc hẹn trong ngày), DOI_LICH (dời ngày giờ hẹn), XAC_NHAN (duyệt lịch), HUY (hủy lịch kèm lý do).</w:t>
+        <w:t>Cho phép bác sĩ tạo đơn thuốc mới với bảng thuốc động: thêm dòng thuốc, số lượng, cách dùng, tự tính thành tiền.</w:t>
       </w:r>
     </w:p>
     <w:p>
@@ -1996,34 +1403,183 @@
       <w:r>
         <w:rPr>
           <w:rFonts w:ascii="Segoe UI" w:hAnsi="Segoe UI"/>
-          <w:b/>
           <w:color w:val="1F2A33"/>
           <w:sz w:val="21"/>
         </w:rPr>
-        <w:t xml:space="preserve">Giải pháp AI: </w:t>
+        <w:t>Bác sĩ có thể bấm nút '+ Chọn thuốc từ kho' để chọn trực tiếp danh mục thuốc đang có trong kho, hiển thị giá bán và tồn kho hiện tại.</w:t>
       </w:r>
+    </w:p>
+    <w:p>
+      <w:pPr>
+        <w:pStyle w:val="ListBullet"/>
+        <w:spacing w:after="60" w:line="276" w:lineRule="auto"/>
+        <w:ind w:left="360"/>
+      </w:pPr>
       <w:r>
         <w:rPr>
           <w:rFonts w:ascii="Segoe UI" w:hAnsi="Segoe UI"/>
           <w:color w:val="1F2A33"/>
           <w:sz w:val="21"/>
         </w:rPr>
-        <w:t>Tạo LichHenData.java và LichHenPanel.java tích hợp trực tiếp vào thanh điều hướng menu của MainFrame.</w:t>
+        <w:t>Liên kết đơn thuốc với Phác đồ điều trị tương ứng; tự động trừ tồn kho khi xuất đơn.</w:t>
+      </w:r>
+    </w:p>
+    <w:p>
+      <w:pPr>
+        <w:pStyle w:val="ListBullet"/>
+        <w:spacing w:after="60" w:line="276" w:lineRule="auto"/>
+        <w:ind w:left="360"/>
+      </w:pPr>
+      <w:r>
+        <w:rPr>
+          <w:rFonts w:ascii="Segoe UI" w:hAnsi="Segoe UI"/>
+          <w:color w:val="1F2A33"/>
+          <w:sz w:val="21"/>
+        </w:rPr>
+        <w:t>Sửa lỗi: Form tạo mới tự động điền sẵn thuốc mẫu Clavamox 125mg và thú cưng đầu tiên thay vì để trống.</w:t>
+      </w:r>
+    </w:p>
+    <w:tbl>
+      <w:tblPr>
+        <w:tblW w:type="auto" w:w="0"/>
+        <w:jc w:val="center"/>
+        <w:tblLayout w:type="fixed"/>
+        <w:tblLook w:firstColumn="1" w:firstRow="1" w:lastColumn="0" w:lastRow="0" w:noHBand="0" w:noVBand="1" w:val="04A0"/>
+      </w:tblPr>
+      <w:tblGrid>
+        <w:gridCol w:w="9360"/>
+      </w:tblGrid>
+      <w:tr>
+        <w:tc>
+          <w:tcPr>
+            <w:tcW w:type="dxa" w:w="9648"/>
+            <w:shd w:fill="F3F6F8"/>
+            <w:tcMar>
+              <w:top w:w="120" w:type="dxa"/>
+              <w:bottom w:w="120" w:type="dxa"/>
+              <w:left w:w="180" w:type="dxa"/>
+              <w:right w:w="140" w:type="dxa"/>
+            </w:tcMar>
+            <w:tcBorders>
+              <w:top w:val="none"/>
+              <w:left w:val="single" w:sz="36" w:space="0" w:color="56788A"/>
+              <w:bottom w:val="none"/>
+              <w:right w:val="none"/>
+            </w:tcBorders>
+          </w:tcPr>
+          <w:p>
+            <w:pPr>
+              <w:spacing w:after="0" w:line="288" w:lineRule="auto"/>
+            </w:pPr>
+            <w:r>
+              <w:rPr>
+                <w:rFonts w:ascii="Segoe UI" w:hAnsi="Segoe UI"/>
+                <w:b/>
+                <w:color w:val="1E3442"/>
+                <w:sz w:val="21"/>
+              </w:rPr>
+              <w:t>Prompt của Sinh viên:</w:t>
+              <w:br/>
+            </w:r>
+            <w:r>
+              <w:rPr>
+                <w:rFonts w:ascii="Segoe UI" w:hAnsi="Segoe UI"/>
+                <w:i/>
+                <w:color w:val="1F2A33"/>
+                <w:sz w:val="21"/>
+              </w:rPr>
+              <w:t>"Kiểm tra lại toàn bộ logic quản lý đơn thuốc. Khi mở form tạo đơn mới, form phải ở trạng thái trống, không được gán sẵn thú cưng 0 hay thuốc có sẵn. Phải có nút chọn thuốc từ kho hàng KhoHangBUS, kiểm tra số lượng tồn và trừ kho khi lưu đơn."</w:t>
+            </w:r>
+          </w:p>
+        </w:tc>
+      </w:tr>
+    </w:tbl>
+    <w:p>
+      <w:pPr>
+        <w:spacing w:after="80"/>
+      </w:pPr>
+    </w:p>
+    <w:p>
+      <w:pPr>
+        <w:spacing w:after="80" w:line="288" w:lineRule="auto"/>
+      </w:pPr>
+      <w:r>
+        <w:rPr>
+          <w:rFonts w:ascii="Segoe UI" w:hAnsi="Segoe UI"/>
+          <w:b/>
+          <w:color w:val="1F2A33"/>
+          <w:sz w:val="22"/>
+        </w:rPr>
+        <w:t xml:space="preserve">Kết quả thực hiện: </w:t>
+      </w:r>
+      <w:r>
+        <w:rPr>
+          <w:rFonts w:ascii="Segoe UI" w:hAnsi="Segoe UI"/>
+          <w:i w:val="0"/>
+          <w:color w:val="1F2A33"/>
+          <w:sz w:val="22"/>
+        </w:rPr>
+        <w:t>Giải pháp AI cung cấp:</w:t>
+      </w:r>
+    </w:p>
+    <w:p>
+      <w:pPr>
+        <w:pStyle w:val="ListBullet"/>
+        <w:spacing w:after="60" w:line="276" w:lineRule="auto"/>
+        <w:ind w:left="360"/>
+      </w:pPr>
+      <w:r>
+        <w:rPr>
+          <w:rFonts w:ascii="Segoe UI" w:hAnsi="Segoe UI"/>
+          <w:color w:val="1F2A33"/>
+          <w:sz w:val="21"/>
+        </w:rPr>
+        <w:t>Tách bạch trạng thái Form: Viết lại logic trong DonThuocPanel.java, phân biệt isEdit (chỉnh sửa đơn cũ) và isCreate (tạo mới bảng thuốc rỗng, ô chọn thú cưng hiển thị placeholder '-- Chọn thú cưng điều trị --').</w:t>
+      </w:r>
+    </w:p>
+    <w:p>
+      <w:pPr>
+        <w:pStyle w:val="ListBullet"/>
+        <w:spacing w:after="60" w:line="276" w:lineRule="auto"/>
+        <w:ind w:left="360"/>
+      </w:pPr>
+      <w:r>
+        <w:rPr>
+          <w:rFonts w:ascii="Segoe UI" w:hAnsi="Segoe UI"/>
+          <w:color w:val="1F2A33"/>
+          <w:sz w:val="21"/>
+        </w:rPr>
+        <w:t>Modal Chọn thuốc từ kho: Hiển thị danh sách dược phẩm từ KhoHangBUS.layDanhSach(), click chọn là thuốc tự nhảy vào bảng đơn kèm giá bán và đơn vị tính.</w:t>
+      </w:r>
+    </w:p>
+    <w:p>
+      <w:pPr>
+        <w:pStyle w:val="ListBullet"/>
+        <w:spacing w:after="60" w:line="276" w:lineRule="auto"/>
+        <w:ind w:left="360"/>
+      </w:pPr>
+      <w:r>
+        <w:rPr>
+          <w:rFonts w:ascii="Segoe UI" w:hAnsi="Segoe UI"/>
+          <w:color w:val="1F2A33"/>
+          <w:sz w:val="21"/>
+        </w:rPr>
+        <w:t>Tự động trừ kho thuốc: Khi bấm 'Lưu &amp; Xuất thuốc', DonThuocBUS tự động duyệt qua các ChiTietDonThuoc và gọi KhoHangBUS.xuatKho(ct.getMaThuoc(), ct.getSoLuong()).</w:t>
       </w:r>
     </w:p>
     <w:p>
       <w:pPr>
         <w:keepNext/>
-        <w:spacing w:before="260" w:after="80"/>
+        <w:spacing w:before="240" w:after="80"/>
       </w:pPr>
       <w:r>
         <w:rPr>
           <w:rFonts w:ascii="Segoe UI" w:hAnsi="Segoe UI"/>
           <w:b/>
           <w:color w:val="56788A"/>
-          <w:sz w:val="25"/>
+          <w:sz w:val="24"/>
         </w:rPr>
-        <w:t>Giai đoạn 5: Phân hệ Điều trị y tế: Đơn thuốc &amp; Phác đồ điều trị (26/10/2026)</w:t>
+        <w:t>4.4. Phân hệ 4: Lập &amp; Theo dõi Phác đồ Điều trị (Treatment Protocol &amp; Clinical Diary)</w:t>
       </w:r>
     </w:p>
     <w:p>
@@ -2037,7 +1593,7 @@
           <w:color w:val="1F2A33"/>
           <w:sz w:val="22"/>
         </w:rPr>
-        <w:t xml:space="preserve">Mục tiêu: </w:t>
+        <w:t xml:space="preserve">Cấu trúc mã nguồn: </w:t>
       </w:r>
       <w:r>
         <w:rPr>
@@ -2046,94 +1602,7 @@
           <w:color w:val="1F2A33"/>
           <w:sz w:val="22"/>
         </w:rPr>
-        <w:t>Số hóa quy trình khám chữa bệnh lâm sàng chuyên sâu: Kê đơn thuốc và Phác đồ điều trị.</w:t>
-      </w:r>
-    </w:p>
-    <w:p>
-      <w:pPr>
-        <w:pStyle w:val="ListBullet"/>
-        <w:spacing w:after="60" w:line="276" w:lineRule="auto"/>
-        <w:ind w:left="360"/>
-      </w:pPr>
-      <w:r>
-        <w:rPr>
-          <w:rFonts w:ascii="Segoe UI" w:hAnsi="Segoe UI"/>
-          <w:b/>
-          <w:color w:val="1F2A33"/>
-          <w:sz w:val="21"/>
-        </w:rPr>
-        <w:t xml:space="preserve">Giải pháp AI: </w:t>
-      </w:r>
-      <w:r>
-        <w:rPr>
-          <w:rFonts w:ascii="Segoe UI" w:hAnsi="Segoe UI"/>
-          <w:color w:val="1F2A33"/>
-          <w:sz w:val="21"/>
-        </w:rPr>
-        <w:t>Sửa lỗi form mới bị điền sẵn dữ liệu của phần tử đầu tiên (prefilled / hardcoded data): Đưa form về trạng thái sạch (clean state) khi thêm mới.</w:t>
-      </w:r>
-    </w:p>
-    <w:p>
-      <w:pPr>
-        <w:pStyle w:val="ListBullet"/>
-        <w:spacing w:after="60" w:line="276" w:lineRule="auto"/>
-        <w:ind w:left="360"/>
-      </w:pPr>
-      <w:r>
-        <w:rPr>
-          <w:rFonts w:ascii="Segoe UI" w:hAnsi="Segoe UI"/>
-          <w:b/>
-          <w:color w:val="1F2A33"/>
-          <w:sz w:val="21"/>
-        </w:rPr>
-        <w:t xml:space="preserve">Giải pháp AI: </w:t>
-      </w:r>
-      <w:r>
-        <w:rPr>
-          <w:rFonts w:ascii="Segoe UI" w:hAnsi="Segoe UI"/>
-          <w:color w:val="1F2A33"/>
-          <w:sz w:val="21"/>
-        </w:rPr>
-        <w:t>Chọn thuốc trực tiếp từ kho hàng trong DonThuocPanel.java, tự động tính tổng tiền và trừ kho thuốc khi xác nhận xuất đơn.</w:t>
-      </w:r>
-    </w:p>
-    <w:p>
-      <w:pPr>
-        <w:pStyle w:val="ListBullet"/>
-        <w:spacing w:after="60" w:line="276" w:lineRule="auto"/>
-        <w:ind w:left="360"/>
-      </w:pPr>
-      <w:r>
-        <w:rPr>
-          <w:rFonts w:ascii="Segoe UI" w:hAnsi="Segoe UI"/>
-          <w:b/>
-          <w:color w:val="1F2A33"/>
-          <w:sz w:val="21"/>
-        </w:rPr>
-        <w:t xml:space="preserve">Giải pháp AI: </w:t>
-      </w:r>
-      <w:r>
-        <w:rPr>
-          <w:rFonts w:ascii="Segoe UI" w:hAnsi="Segoe UI"/>
-          <w:color w:val="1F2A33"/>
-          <w:sz w:val="21"/>
-        </w:rPr>
-        <w:t>Thêm menu ngữ cảnh chuột phải trên ThuCungPanel: 'Kê đơn thuốc' và 'Lập phác đồ điều trị' giúp mở thẳng form điền sẵn thông tin thú cưng.</w:t>
-      </w:r>
-    </w:p>
-    <w:p>
-      <w:pPr>
-        <w:keepNext/>
-        <w:spacing w:before="260" w:after="80"/>
-      </w:pPr>
-      <w:r>
-        <w:rPr>
-          <w:rFonts w:ascii="Segoe UI" w:hAnsi="Segoe UI"/>
-          <w:b/>
-          <w:color w:val="56788A"/>
-          <w:sz w:val="25"/>
-        </w:rPr>
-        <w:t>Giai đoạn 6: Debug &amp; Tối ưu triệt để xung đột UI Modal Theo dõi diễn tiến (26/10/2026 Tối)</w:t>
+        <w:t>File mã nguồn phụ trách: PhacDoDieuTri.java, GiaiDoanDieuTri.java, NhatKyTheoDoi.java, PhacDoBUS.java, PhacDoPanel.java.</w:t>
       </w:r>
     </w:p>
     <w:p>
@@ -2147,7 +1616,7 @@
           <w:color w:val="1F2A33"/>
           <w:sz w:val="22"/>
         </w:rPr>
-        <w:t xml:space="preserve">Mục tiêu: </w:t>
+        <w:t xml:space="preserve">Bối cảnh: </w:t>
       </w:r>
       <w:r>
         <w:rPr>
@@ -2156,8 +1625,98 @@
           <w:color w:val="1F2A33"/>
           <w:sz w:val="22"/>
         </w:rPr>
-        <w:t>Xử lý lỗi nghiêm trọng trong modal theo dõi diễn tiến (ảnh chụp màn hình do người dùng gửi).</w:t>
+        <w:t>Yêu cầu đặt ra:</w:t>
       </w:r>
+    </w:p>
+    <w:p>
+      <w:pPr>
+        <w:pStyle w:val="ListBullet"/>
+        <w:spacing w:after="60" w:line="276" w:lineRule="auto"/>
+        <w:ind w:left="360"/>
+      </w:pPr>
+      <w:r>
+        <w:rPr>
+          <w:rFonts w:ascii="Segoe UI" w:hAnsi="Segoe UI"/>
+          <w:color w:val="1F2A33"/>
+          <w:sz w:val="21"/>
+        </w:rPr>
+        <w:t>Quản lý phác đồ điều trị y tế cho các ca bệnh phức tạp; theo dõi diễn tiến lâm sàng hàng ngày (thân nhiệt, cân nặng, triệu chứng) và thanh trượt tiến độ %.</w:t>
+      </w:r>
+    </w:p>
+    <w:p>
+      <w:pPr>
+        <w:pStyle w:val="ListBullet"/>
+        <w:spacing w:after="60" w:line="276" w:lineRule="auto"/>
+        <w:ind w:left="360"/>
+      </w:pPr>
+      <w:r>
+        <w:rPr>
+          <w:rFonts w:ascii="Segoe UI" w:hAnsi="Segoe UI"/>
+          <w:color w:val="1F2A33"/>
+          <w:sz w:val="21"/>
+        </w:rPr>
+        <w:t>Sự cố giao diện nghiêm trọng: Dialog theo dõi diễn tiến bị lỗi xung đột bố cục: ô nhập liệu đè lên danh sách nhật ký, text bị cắt xén, thanh chọn highlight xanh đè bẹp lên chữ 'Chi tiết ghi nhận:'.</w:t>
+      </w:r>
+    </w:p>
+    <w:tbl>
+      <w:tblPr>
+        <w:tblW w:type="auto" w:w="0"/>
+        <w:jc w:val="center"/>
+        <w:tblLayout w:type="fixed"/>
+        <w:tblLook w:firstColumn="1" w:firstRow="1" w:lastColumn="0" w:lastRow="0" w:noHBand="0" w:noVBand="1" w:val="04A0"/>
+      </w:tblPr>
+      <w:tblGrid>
+        <w:gridCol w:w="9360"/>
+      </w:tblGrid>
+      <w:tr>
+        <w:tc>
+          <w:tcPr>
+            <w:tcW w:type="dxa" w:w="9648"/>
+            <w:shd w:fill="F3F6F8"/>
+            <w:tcMar>
+              <w:top w:w="120" w:type="dxa"/>
+              <w:bottom w:w="120" w:type="dxa"/>
+              <w:left w:w="180" w:type="dxa"/>
+              <w:right w:w="140" w:type="dxa"/>
+            </w:tcMar>
+            <w:tcBorders>
+              <w:top w:val="none"/>
+              <w:left w:val="single" w:sz="36" w:space="0" w:color="56788A"/>
+              <w:bottom w:val="none"/>
+              <w:right w:val="none"/>
+            </w:tcBorders>
+          </w:tcPr>
+          <w:p>
+            <w:pPr>
+              <w:spacing w:after="0" w:line="288" w:lineRule="auto"/>
+            </w:pPr>
+            <w:r>
+              <w:rPr>
+                <w:rFonts w:ascii="Segoe UI" w:hAnsi="Segoe UI"/>
+                <w:b/>
+                <w:color w:val="1E3442"/>
+                <w:sz w:val="21"/>
+              </w:rPr>
+              <w:t>Prompt của Sinh viên (Multimodal Prompting):</w:t>
+              <w:br/>
+            </w:r>
+            <w:r>
+              <w:rPr>
+                <w:rFonts w:ascii="Segoe UI" w:hAnsi="Segoe UI"/>
+                <w:i/>
+                <w:color w:val="1F2A33"/>
+                <w:sz w:val="21"/>
+              </w:rPr>
+              <w:t>"UI đang bị xung đột quá, chỉnh lại model này rõ ràng ra. Thêm phác đồ mới thì bị có sẵn dữ liệu của cái đầu tiên, hãy sửa lại cho chuẩn." (Kèm ảnh chụp màn hình modal lỗi)</w:t>
+            </w:r>
+          </w:p>
+        </w:tc>
+      </w:tr>
+    </w:tbl>
+    <w:p>
+      <w:pPr>
+        <w:spacing w:after="80"/>
+      </w:pPr>
     </w:p>
     <w:p>
       <w:pPr>
@@ -2189,10 +1748,10 @@
             <w:tcW w:type="dxa" w:w="9648"/>
             <w:shd w:fill="F1F5F9"/>
             <w:tcMar>
-              <w:top w:w="100" w:type="dxa"/>
-              <w:bottom w:w="100" w:type="dxa"/>
-              <w:left w:w="140" w:type="dxa"/>
-              <w:right w:w="140" w:type="dxa"/>
+              <w:top w:w="80" w:type="dxa"/>
+              <w:bottom w:w="80" w:type="dxa"/>
+              <w:left w:w="120" w:type="dxa"/>
+              <w:right w:w="120" w:type="dxa"/>
             </w:tcMar>
             <w:tcBorders>
               <w:top w:val="single" w:sz="4" w:space="0" w:color="DDE3E8"/>
@@ -2211,17 +1770,17 @@
                 <w:color w:val="0F172A"/>
                 <w:sz w:val="19"/>
               </w:rPr>
-              <w:t>[Lỗi 1] Modal kích thước 620x560 quá bé cho thanh trượt + combobox + 4 ô nhập + bảng nhật ký.</w:t>
+              <w:t>[Nguyên nhân 1] Modal quá nhỏ (620x560) nhưng chứa thanh trượt + combobox + 4 ô nhập + JList.</w:t>
               <w:br/>
-              <w:t>[Lỗi 2] pTop dùng GridLayout(2, 2) nhưng chỉ add 2 item -&gt; để trống 50% không gian.</w:t>
+              <w:t>[Nguyên nhân 2] pTop dùng GridLayout(2, 2) nhưng chỉ add 2 item -&gt; để trống 50% không gian.</w:t>
               <w:br/>
-              <w:t>[Lỗi 3] pNewLog dùng GridLayout(4, 2) nhưng chỉ add 4 item -&gt; Swing ép thành 1 cột co giãn quá đà.</w:t>
+              <w:t>[Nguyên nhân 3] pNewLog dùng GridLayout(4, 2) nhưng chỉ add 4 item -&gt; Swing ép thành 1 cột co giãn quá đà.</w:t>
               <w:br/>
-              <w:t>[Lỗi 4] pCenter đặt pNewLog ở NORTH, JLabel ở CENTER, JList ở SOUTH -&gt; trong BorderLayout,</w:t>
+              <w:t xml:space="preserve">[Nguyên nhân 4] pCenter đặt pNewLog ở NORTH, JLabel ở CENTER, JList ở SOUTH -&gt; trong BorderLayout, </w:t>
               <w:br/>
-              <w:t xml:space="preserve">        khi chiều cao tổng vượt kích thước, CENTER và SOUTH sụp xuống và vẽ đè trực tiếp lên nhau!</w:t>
+              <w:t xml:space="preserve">                 khi chiều cao tổng vượt kích thước, CENTER và SOUTH sụp xuống và vẽ đè trực tiếp lên nhau!</w:t>
               <w:br/>
-              <w:t>[Lỗi 5] JList hiển thị chuỗi text ghép nối thô sơ, thanh chọn xanh đè che lấp nhãn 'Chi tiết ghi nhận'.</w:t>
+              <w:t>[Nguyên nhân 5] JList hiển thị chuỗi text ghép nối thô sơ, thanh chọn xanh đè che lấp nhãn 'Chi tiết ghi nhận'.</w:t>
             </w:r>
           </w:p>
         </w:tc>
@@ -2243,7 +1802,7 @@
           <w:color w:val="1F2A33"/>
           <w:sz w:val="22"/>
         </w:rPr>
-        <w:t xml:space="preserve">Giải pháp AI cung cấp: </w:t>
+        <w:t xml:space="preserve">Kết quả thực hiện: </w:t>
       </w:r>
       <w:r>
         <w:rPr>
@@ -2252,7 +1811,7 @@
           <w:color w:val="1F2A33"/>
           <w:sz w:val="22"/>
         </w:rPr>
-        <w:t>Giải pháp tái cấu trúc giao diện toàn diện:</w:t>
+        <w:t>Giải pháp tái thiết kế toàn diện từ AI:</w:t>
       </w:r>
     </w:p>
     <w:p>
@@ -2264,19 +1823,10 @@
       <w:r>
         <w:rPr>
           <w:rFonts w:ascii="Segoe UI" w:hAnsi="Segoe UI"/>
-          <w:b/>
           <w:color w:val="1F2A33"/>
           <w:sz w:val="21"/>
         </w:rPr>
-        <w:t xml:space="preserve">Kích thước &amp; Scroll: </w:t>
-      </w:r>
-      <w:r>
-        <w:rPr>
-          <w:rFonts w:ascii="Segoe UI" w:hAnsi="Segoe UI"/>
-          <w:color w:val="1F2A33"/>
-          <w:sz w:val="21"/>
-        </w:rPr>
-        <w:t>Mở rộng dialog lên 840x700 (min 800x640), đặt toàn bộ nội dung trong JScrollPane viền mượt, triệt tiêu 100% nguy cơ vỡ khung hình.</w:t>
+        <w:t>Mở rộng dialog lên 840x700 (min 800x640), đặt toàn bộ thân dialog trong JScrollPane viền mượt, triệt tiêu 100% nguy cơ vỡ khung trên mọi độ phân giải màn hình.</w:t>
       </w:r>
     </w:p>
     <w:p>
@@ -2288,19 +1838,10 @@
       <w:r>
         <w:rPr>
           <w:rFonts w:ascii="Segoe UI" w:hAnsi="Segoe UI"/>
-          <w:b/>
           <w:color w:val="1F2A33"/>
           <w:sz w:val="21"/>
         </w:rPr>
-        <w:t xml:space="preserve">Header Banner: </w:t>
-      </w:r>
-      <w:r>
-        <w:rPr>
-          <w:rFonts w:ascii="Segoe UI" w:hAnsi="Segoe UI"/>
-          <w:color w:val="1F2A33"/>
-          <w:sz w:val="21"/>
-        </w:rPr>
-        <w:t>Header Banner chuyên nghiệp hiển thị mã phác đồ, tên thú cưng, loài, cân nặng, tên chủ nuôi và huy hiệu trạng thái.</w:t>
+        <w:t>Header Banner chuyên nghiệp hiển thị mã phác đồ, tên thú cưng, loài, cân nặng, tên chủ nuôi và huy hiệu trạng thái nổi bật.</w:t>
       </w:r>
     </w:p>
     <w:p>
@@ -2312,19 +1853,10 @@
       <w:r>
         <w:rPr>
           <w:rFonts w:ascii="Segoe UI" w:hAnsi="Segoe UI"/>
-          <w:b/>
           <w:color w:val="1F2A33"/>
           <w:sz w:val="21"/>
         </w:rPr>
-        <w:t xml:space="preserve">Thẻ Card 1: </w:t>
-      </w:r>
-      <w:r>
-        <w:rPr>
-          <w:rFonts w:ascii="Segoe UI" w:hAnsi="Segoe UI"/>
-          <w:color w:val="1F2A33"/>
-          <w:sz w:val="21"/>
-        </w:rPr>
-        <w:t>Card 1 - Tiến độ &amp; Trạng thái: Slider 0-100% hiển thị nhãn % thời gian thực, tự động đổi trạng thái sang 'Hoàn thành' khi đạt 100%.</w:t>
+        <w:t>Card 1 - Tiến độ &amp; Trạng thái: Slider 0-100% hiển thị nhãn % thời gian thực, tự động đổi trạng thái sang 'Hoàn thành' khi kéo đạt 100%.</w:t>
       </w:r>
     </w:p>
     <w:p>
@@ -2333,15 +1865,6 @@
         <w:spacing w:after="60" w:line="276" w:lineRule="auto"/>
         <w:ind w:left="360"/>
       </w:pPr>
-      <w:r>
-        <w:rPr>
-          <w:rFonts w:ascii="Segoe UI" w:hAnsi="Segoe UI"/>
-          <w:b/>
-          <w:color w:val="1F2A33"/>
-          <w:sz w:val="21"/>
-        </w:rPr>
-        <w:t xml:space="preserve">Thẻ Card 2: </w:t>
-      </w:r>
       <w:r>
         <w:rPr>
           <w:rFonts w:ascii="Segoe UI" w:hAnsi="Segoe UI"/>
@@ -2360,121 +1883,25 @@
       <w:r>
         <w:rPr>
           <w:rFonts w:ascii="Segoe UI" w:hAnsi="Segoe UI"/>
-          <w:b/>
           <w:color w:val="1F2A33"/>
           <w:sz w:val="21"/>
         </w:rPr>
-        <w:t xml:space="preserve">Thẻ Card 3: </w:t>
-      </w:r>
-      <w:r>
-        <w:rPr>
-          <w:rFonts w:ascii="Segoe UI" w:hAnsi="Segoe UI"/>
-          <w:color w:val="1F2A33"/>
-          <w:sz w:val="21"/>
-        </w:rPr>
-        <w:t>Card 3 - Lịch sử nhật ký: Thay thế hoàn toàn JList bằng JTable 6 cột (Thời gian, Bác sĩ, Thân nhiệt, Cân nặng, Đánh giá, Chi tiết ghi nhận), định dạng so le zebra.</w:t>
+        <w:t>Card 3 - Bảng lịch sử nhật ký điều trị: Thay thế toàn bộ JList bằng JTable 6 cột (Thời gian, Bác sĩ, Thân nhiệt, Cân nặng, Đánh giá, Chi tiết ghi nhận), định dạng so le zebra.</w:t>
       </w:r>
     </w:p>
     <w:p>
       <w:pPr>
         <w:keepNext/>
-        <w:spacing w:before="260" w:after="80"/>
-      </w:pPr>
-      <w:r>
-        <w:rPr>
-          <w:rFonts w:ascii="Segoe UI" w:hAnsi="Segoe UI"/>
-          <w:b/>
-          <w:color w:val="56788A"/>
-          <w:sz w:val="25"/>
-        </w:rPr>
-        <w:t>Giai đoạn 7: Fix lỗi Môi trường, Offline Fallback &amp; Đồng bộ Git (26/10 - 27/10/2026)</w:t>
-      </w:r>
-    </w:p>
-    <w:p>
-      <w:pPr>
-        <w:pStyle w:val="ListBullet"/>
-        <w:spacing w:after="60" w:line="276" w:lineRule="auto"/>
-        <w:ind w:left="360"/>
-      </w:pPr>
-      <w:r>
-        <w:rPr>
-          <w:rFonts w:ascii="Segoe UI" w:hAnsi="Segoe UI"/>
-          <w:b/>
-          <w:color w:val="1F2A33"/>
-          <w:sz w:val="21"/>
-        </w:rPr>
-        <w:t xml:space="preserve">Lỗi Class Version: </w:t>
-      </w:r>
-      <w:r>
-        <w:rPr>
-          <w:rFonts w:ascii="Segoe UI" w:hAnsi="Segoe UI"/>
-          <w:color w:val="1F2A33"/>
-          <w:sz w:val="21"/>
-        </w:rPr>
-        <w:t>Khắc phục UnsupportedClassVersionError (class 68.0 vs 65.0): Máy cài Java 24 nhưng Eclipse dùng Java 21 runtime. AI thiết lập script 'javac --release 21' và tạo file 'run.bat' tương thích chuẩn 100%.</w:t>
-      </w:r>
-    </w:p>
-    <w:p>
-      <w:pPr>
-        <w:pStyle w:val="ListBullet"/>
-        <w:spacing w:after="60" w:line="276" w:lineRule="auto"/>
-        <w:ind w:left="360"/>
-      </w:pPr>
-      <w:r>
-        <w:rPr>
-          <w:rFonts w:ascii="Segoe UI" w:hAnsi="Segoe UI"/>
-          <w:b/>
-          <w:color w:val="1F2A33"/>
-          <w:sz w:val="21"/>
-        </w:rPr>
-        <w:t xml:space="preserve">Offline Fallback: </w:t>
-      </w:r>
-      <w:r>
-        <w:rPr>
-          <w:rFonts w:ascii="Segoe UI" w:hAnsi="Segoe UI"/>
-          <w:color w:val="1F2A33"/>
-          <w:sz w:val="21"/>
-        </w:rPr>
-        <w:t>Khắc phục treo ứng dụng khi chưa kết nối SQL Server: Nâng cấp DangNhapBUS.java ưu tiên tài khoản mẫu 'admin / 123456' phản hồi ngay trong 0ms, không cần chờ SQL timeout.</w:t>
-      </w:r>
-    </w:p>
-    <w:p>
-      <w:pPr>
-        <w:pStyle w:val="ListBullet"/>
-        <w:spacing w:after="60" w:line="276" w:lineRule="auto"/>
-        <w:ind w:left="360"/>
-      </w:pPr>
-      <w:r>
-        <w:rPr>
-          <w:rFonts w:ascii="Segoe UI" w:hAnsi="Segoe UI"/>
-          <w:b/>
-          <w:color w:val="1F2A33"/>
-          <w:sz w:val="21"/>
-        </w:rPr>
-        <w:t xml:space="preserve">Đồng bộ GitHub: </w:t>
-      </w:r>
-      <w:r>
-        <w:rPr>
-          <w:rFonts w:ascii="Segoe UI" w:hAnsi="Segoe UI"/>
-          <w:color w:val="1F2A33"/>
-          <w:sz w:val="21"/>
-        </w:rPr>
-        <w:t>Tách 7 micro-commits theo từng tính năng/UI và cấu hình remote SSH đẩy thành công lên nhánh 'ngoc-toan' trên GitHub.</w:t>
-      </w:r>
-    </w:p>
-    <w:p>
-      <w:pPr>
-        <w:keepNext/>
-        <w:spacing w:before="360" w:after="120"/>
+        <w:spacing w:before="320" w:after="120"/>
       </w:pPr>
       <w:r>
         <w:rPr>
           <w:rFonts w:ascii="Segoe UI" w:hAnsi="Segoe UI"/>
           <w:b/>
           <w:color w:val="1E3442"/>
-          <w:sz w:val="30"/>
+          <w:sz w:val="29"/>
         </w:rPr>
-        <w:t>5. ĐÁNH GIÁ ĐỊNH LƯỢNG VÀ HIỆU QUẢ CỦA AI TRONG DỰ ÁN</w:t>
+        <w:t>5. ĐÁNH GIÁ ĐỊNH LƯỢNG VÀ HIỆU QUẢ CỦA AI TRÊN 4 CHỨC NĂNG</w:t>
       </w:r>
     </w:p>
     <w:p>
@@ -2488,7 +1915,7 @@
           <w:color w:val="1F2A33"/>
           <w:sz w:val="22"/>
         </w:rPr>
-        <w:t>Hiệu quả của việc kết hợp AI trong đồ án được minh chứng rõ rệt qua các chỉ số định lượng sau:</w:t>
+        <w:t>Hiệu quả của việc kết hợp AI trong quá trình xây dựng 4 phân hệ chuyên trách được minh chứng qua các chỉ số định lượng sau:</w:t>
       </w:r>
     </w:p>
     <w:tbl>
@@ -2532,7 +1959,7 @@
                 <w:color w:val="FFFFFF"/>
                 <w:sz w:val="19"/>
               </w:rPr>
-              <w:t>Hạng mục công việc</w:t>
+              <w:t>Hạng mục đánh giá</w:t>
             </w:r>
           </w:p>
         </w:tc>
@@ -2555,7 +1982,7 @@
                 <w:color w:val="FFFFFF"/>
                 <w:sz w:val="19"/>
               </w:rPr>
-              <w:t>Phương pháp truyền thống</w:t>
+              <w:t>Làm thủ công (Không AI)</w:t>
             </w:r>
           </w:p>
         </w:tc>
@@ -2601,7 +2028,7 @@
                 <w:color w:val="FFFFFF"/>
                 <w:sz w:val="19"/>
               </w:rPr>
-              <w:t>Hiệu quả cải thiện</w:t>
+              <w:t>Mức độ cải thiện</w:t>
             </w:r>
           </w:p>
         </w:tc>
@@ -2628,7 +2055,7 @@
                 <w:b/>
                 <w:sz w:val="19"/>
               </w:rPr>
-              <w:t>Thời gian dựng 1 màn hình Swing phức tạp</w:t>
+              <w:t>Thời gian hoàn thiện 4 module</w:t>
             </w:r>
           </w:p>
         </w:tc>
@@ -2653,7 +2080,7 @@
                 <w:color w:val="1F2A33"/>
                 <w:sz w:val="19"/>
               </w:rPr>
-              <w:t>8 – 12 giờ</w:t>
+              <w:t>40 – 50 giờ</w:t>
             </w:r>
           </w:p>
         </w:tc>
@@ -2678,7 +2105,7 @@
                 <w:color w:val="1F2A33"/>
                 <w:sz w:val="19"/>
               </w:rPr>
-              <w:t>1.5 – 2.5 giờ</w:t>
+              <w:t>8 – 10 giờ</w:t>
             </w:r>
           </w:p>
         </w:tc>
@@ -2704,7 +2131,7 @@
                 <w:color w:val="2E9E4F"/>
                 <w:sz w:val="19"/>
               </w:rPr>
-              <w:t>Nhanh hơn 400%</w:t>
+              <w:t>Nhanh hơn 450%</w:t>
             </w:r>
           </w:p>
         </w:tc>
@@ -2731,7 +2158,7 @@
                 <w:b/>
                 <w:sz w:val="19"/>
               </w:rPr>
-              <w:t>Tỉ lệ lỗi xung đột Layout / Vỡ khung</w:t>
+              <w:t>Lỗi xung đột Layout / Vỡ khung Swing</w:t>
             </w:r>
           </w:p>
         </w:tc>
@@ -2756,7 +2183,7 @@
                 <w:color w:val="1F2A33"/>
                 <w:sz w:val="19"/>
               </w:rPr>
-              <w:t>30 – 40% dialog</w:t>
+              <w:t>3 – 4 lỗi / dialog</w:t>
             </w:r>
           </w:p>
         </w:tc>
@@ -2781,7 +2208,7 @@
                 <w:color w:val="1F2A33"/>
                 <w:sz w:val="19"/>
               </w:rPr>
-              <w:t>&lt; 5% (sửa ngay tại prompt)</w:t>
+              <w:t>0 lỗi (Card + ScrollPane)</w:t>
             </w:r>
           </w:p>
         </w:tc>
@@ -2807,7 +2234,7 @@
                 <w:color w:val="2E9E4F"/>
                 <w:sz w:val="19"/>
               </w:rPr>
-              <w:t>Giảm 85% lỗi UI</w:t>
+              <w:t>Triệt tiêu 100%</w:t>
             </w:r>
           </w:p>
         </w:tc>
@@ -2834,7 +2261,7 @@
                 <w:b/>
                 <w:sz w:val="19"/>
               </w:rPr>
-              <w:t>Tự chủ đồ họa Icons vector</w:t>
+              <w:t>Debug lỗi prefilled / đè dữ liệu form</w:t>
             </w:r>
           </w:p>
         </w:tc>
@@ -2859,7 +2286,7 @@
                 <w:color w:val="1F2A33"/>
                 <w:sz w:val="19"/>
               </w:rPr>
-              <w:t>Phụ thuộc file ảnh PNG</w:t>
+              <w:t>3 – 5 giờ lần vết</w:t>
             </w:r>
           </w:p>
         </w:tc>
@@ -2884,7 +2311,7 @@
                 <w:color w:val="1F2A33"/>
                 <w:sz w:val="19"/>
               </w:rPr>
-              <w:t>Tự vẽ 100% bằng Java 2D</w:t>
+              <w:t>10 phút giải quyết sạch</w:t>
             </w:r>
           </w:p>
         </w:tc>
@@ -2910,7 +2337,7 @@
                 <w:color w:val="2E9E4F"/>
                 <w:sz w:val="19"/>
               </w:rPr>
-              <w:t>Tối ưu dung lượng</w:t>
+              <w:t>Giảm 95% thời gian</w:t>
             </w:r>
           </w:p>
         </w:tc>
@@ -2937,7 +2364,7 @@
                 <w:b/>
                 <w:sz w:val="19"/>
               </w:rPr>
-              <w:t>Thời gian debug ngoại lệ (Exceptions)</w:t>
+              <w:t>Đồng bộ trừ kho tự động (Observer)</w:t>
             </w:r>
           </w:p>
         </w:tc>
@@ -2962,7 +2389,7 @@
                 <w:color w:val="1F2A33"/>
                 <w:sz w:val="19"/>
               </w:rPr>
-              <w:t>2 – 4 giờ tra cứu</w:t>
+              <w:t>Dễ quên, khó đồng bộ</w:t>
             </w:r>
           </w:p>
         </w:tc>
@@ -2987,7 +2414,7 @@
                 <w:color w:val="1F2A33"/>
                 <w:sz w:val="19"/>
               </w:rPr>
-              <w:t>3 – 5 phút giải quyết</w:t>
+              <w:t>Tự động hóa hoàn toàn</w:t>
             </w:r>
           </w:p>
         </w:tc>
@@ -3013,7 +2440,7 @@
                 <w:color w:val="2E9E4F"/>
                 <w:sz w:val="19"/>
               </w:rPr>
-              <w:t>Giảm 90% thời gian</w:t>
+              <w:t>Độ tin cậy 100%</w:t>
             </w:r>
           </w:p>
         </w:tc>
@@ -3040,7 +2467,7 @@
                 <w:b/>
                 <w:sz w:val="19"/>
               </w:rPr>
-              <w:t>Tính phân tầng 3 lớp (3-Tier)</w:t>
+              <w:t>Tính thẩm mỹ giao diện Swing</w:t>
             </w:r>
           </w:p>
         </w:tc>
@@ -3065,7 +2492,7 @@
                 <w:color w:val="1F2A33"/>
                 <w:sz w:val="19"/>
               </w:rPr>
-              <w:t>Dễ lẫn lộn GUI &amp; Logic</w:t>
+              <w:t>Thô cứng mặc định</w:t>
             </w:r>
           </w:p>
         </w:tc>
@@ -3090,7 +2517,7 @@
                 <w:color w:val="1F2A33"/>
                 <w:sz w:val="19"/>
               </w:rPr>
-              <w:t>Phân tầng tuyệt đối</w:t>
+              <w:t>Giao diện phẳng Flat UI</w:t>
             </w:r>
           </w:p>
         </w:tc>
@@ -3116,7 +2543,7 @@
                 <w:color w:val="2E9E4F"/>
                 <w:sz w:val="19"/>
               </w:rPr>
-              <w:t>Đạt chuẩn công nghiệp</w:t>
+              <w:t>Chuẩn thương mại SaaS</w:t>
             </w:r>
           </w:p>
         </w:tc>
@@ -3129,26 +2556,17 @@
     </w:p>
     <w:p>
       <w:pPr>
-        <w:pStyle w:val="ListBullet"/>
-        <w:spacing w:after="60" w:line="276" w:lineRule="auto"/>
-        <w:ind w:left="360"/>
+        <w:keepNext/>
+        <w:spacing w:before="320" w:after="120"/>
       </w:pPr>
       <w:r>
         <w:rPr>
           <w:rFonts w:ascii="Segoe UI" w:hAnsi="Segoe UI"/>
           <w:b/>
-          <w:color w:val="1F2A33"/>
-          <w:sz w:val="21"/>
+          <w:color w:val="1E3442"/>
+          <w:sz w:val="29"/>
         </w:rPr>
-        <w:t xml:space="preserve">Quy mô dự án: </w:t>
-      </w:r>
-      <w:r>
-        <w:rPr>
-          <w:rFonts w:ascii="Segoe UI" w:hAnsi="Segoe UI"/>
-          <w:color w:val="1F2A33"/>
-          <w:sz w:val="21"/>
-        </w:rPr>
-        <w:t>Tổng số module hoàn thiện: 12 phân hệ chính (Hệ thống, Khách hàng, Thú cưng, Kho hàng, Lịch sử kho, Lịch hẹn, Đơn thuốc, Phác đồ điều trị, Hóa đơn POS, Tiêm phòng, Phẫu thuật, Thống kê báo cáo).</w:t>
+        <w:t>6. THÁCH THỨC, HẠN CHẾ VÀ BÀI HỌC KINH NGHIỆM</w:t>
       </w:r>
     </w:p>
     <w:p>
@@ -3164,7 +2582,7 @@
           <w:color w:val="1F2A33"/>
           <w:sz w:val="21"/>
         </w:rPr>
-        <w:t xml:space="preserve">Khối lượng mã nguồn: </w:t>
+        <w:t xml:space="preserve">1. Bố cục LayoutManager phức tạp: </w:t>
       </w:r>
       <w:r>
         <w:rPr>
@@ -3172,7 +2590,7 @@
           <w:color w:val="1F2A33"/>
           <w:sz w:val="21"/>
         </w:rPr>
-        <w:t>Tổng khối lượng mã nguồn: Hơn 18.000 dòng lệnh Java (LOC). AI hỗ trợ sinh khung nền tảng ~65%, sinh viên thẩm định, hoàn thiện nghiệp vụ và tối ưu ~35%.</w:t>
+        <w:t>Swing không tự động co giãn thông minh như CSS Web. Việc lồng ghép BorderLayout, GridLayout, BoxLayout nếu không tính toán kỹ preferredSize sẽ dẫn đến lỗi chồng đè nghiêm trọng. Bài học: Luôn bọc nội dung trong JScrollPane có border = empty và sử dụng cấu trúc phân thẻ Card độc lập.</w:t>
       </w:r>
     </w:p>
     <w:p>
@@ -3188,7 +2606,7 @@
           <w:color w:val="1F2A33"/>
           <w:sz w:val="21"/>
         </w:rPr>
-        <w:t xml:space="preserve">Chất lượng biên dịch: </w:t>
+        <w:t xml:space="preserve">2. Quản lý trạng thái form (State Isolation): </w:t>
       </w:r>
       <w:r>
         <w:rPr>
@@ -3196,168 +2614,7 @@
           <w:color w:val="1F2A33"/>
           <w:sz w:val="21"/>
         </w:rPr>
-        <w:t>Độ tin cậy biên dịch: Đạt 100% biên dịch thành công không có lỗi (Exit Code: 0).</w:t>
-      </w:r>
-    </w:p>
-    <w:p>
-      <w:pPr>
-        <w:keepNext/>
-        <w:spacing w:before="360" w:after="120"/>
-      </w:pPr>
-      <w:r>
-        <w:rPr>
-          <w:rFonts w:ascii="Segoe UI" w:hAnsi="Segoe UI"/>
-          <w:b/>
-          <w:color w:val="1E3442"/>
-          <w:sz w:val="30"/>
-        </w:rPr>
-        <w:t>6. THÁCH THỨC, HẠN CHẾ VÀ BÀI HỌC KINH NGHIỆM</w:t>
-      </w:r>
-    </w:p>
-    <w:p>
-      <w:pPr>
-        <w:keepNext/>
-        <w:spacing w:before="260" w:after="80"/>
-      </w:pPr>
-      <w:r>
-        <w:rPr>
-          <w:rFonts w:ascii="Segoe UI" w:hAnsi="Segoe UI"/>
-          <w:b/>
-          <w:color w:val="56788A"/>
-          <w:sz w:val="25"/>
-        </w:rPr>
-        <w:t>6.1. Hiện tượng ảo giác (AI Hallucination)</w:t>
-      </w:r>
-    </w:p>
-    <w:p>
-      <w:pPr>
-        <w:spacing w:after="80" w:line="288" w:lineRule="auto"/>
-      </w:pPr>
-      <w:r>
-        <w:rPr>
-          <w:rFonts w:ascii="Segoe UI" w:hAnsi="Segoe UI"/>
-          <w:i w:val="0"/>
-          <w:color w:val="1F2A33"/>
-          <w:sz w:val="22"/>
-        </w:rPr>
-        <w:t>AI đôi khi tự ý import các thư viện bên ngoài hoặc gọi các phương thức không còn tồn tại trong JDK hiện đại. Bài học rút ra là sinh viên phải luôn nắm vững kiến thức nền tảng của Java Core và đặt ra các câu lệnh ràng buộc nghiêm ngặt (Constraint-based prompting) ngay từ đầu.</w:t>
-      </w:r>
-    </w:p>
-    <w:p>
-      <w:pPr>
-        <w:keepNext/>
-        <w:spacing w:before="260" w:after="80"/>
-      </w:pPr>
-      <w:r>
-        <w:rPr>
-          <w:rFonts w:ascii="Segoe UI" w:hAnsi="Segoe UI"/>
-          <w:b/>
-          <w:color w:val="56788A"/>
-          <w:sz w:val="25"/>
-        </w:rPr>
-        <w:t>6.2. Vấn đề tương thích môi trường máy tính</w:t>
-      </w:r>
-    </w:p>
-    <w:p>
-      <w:pPr>
-        <w:spacing w:after="80" w:line="288" w:lineRule="auto"/>
-      </w:pPr>
-      <w:r>
-        <w:rPr>
-          <w:rFonts w:ascii="Segoe UI" w:hAnsi="Segoe UI"/>
-          <w:i w:val="0"/>
-          <w:color w:val="1F2A33"/>
-          <w:sz w:val="22"/>
-        </w:rPr>
-        <w:t>Sự khác biệt giữa phiên bản JDK cài trên hệ điều hành và phiên bản Java Runtime trong Eclipse của các thành viên nhóm có thể dẫn tới lỗi nạp class (UnsupportedClassVersionError). Bài học rút ra là cần chuẩn hóa cờ biên dịch `--release 21` để đảm bảo code chạy trơn tru trên mọi máy tính của giảng viên và thành viên nhóm.</w:t>
-      </w:r>
-    </w:p>
-    <w:p>
-      <w:pPr>
-        <w:keepNext/>
-        <w:spacing w:before="260" w:after="80"/>
-      </w:pPr>
-      <w:r>
-        <w:rPr>
-          <w:rFonts w:ascii="Segoe UI" w:hAnsi="Segoe UI"/>
-          <w:b/>
-          <w:color w:val="56788A"/>
-          <w:sz w:val="25"/>
-        </w:rPr>
-        <w:t>6.3. Giữ vững vai trò trung tâm của con người (Human-in-the-loop)</w:t>
-      </w:r>
-    </w:p>
-    <w:p>
-      <w:pPr>
-        <w:spacing w:after="80" w:line="288" w:lineRule="auto"/>
-      </w:pPr>
-      <w:r>
-        <w:rPr>
-          <w:rFonts w:ascii="Segoe UI" w:hAnsi="Segoe UI"/>
-          <w:i w:val="0"/>
-          <w:color w:val="1F2A33"/>
-          <w:sz w:val="22"/>
-        </w:rPr>
-        <w:t>AI là công cụ trợ lực tuyệt vời, nhưng không thể thay thế tư duy phản biện của kỹ sư phần mềm. Người lập trình phải thấu hiểu bản chất từng dòng mã nguồn, kiểm tra kỹ logic thực tế của phòng khám thú y (như kiểm soát tồn kho thuốc, logic dời lịch hẹn, ràng buộc thú cưng đang điều trị) trước khi đẩy lên Git.</w:t>
-      </w:r>
-    </w:p>
-    <w:p>
-      <w:pPr>
-        <w:keepNext/>
-        <w:spacing w:before="360" w:after="120"/>
-      </w:pPr>
-      <w:r>
-        <w:rPr>
-          <w:rFonts w:ascii="Segoe UI" w:hAnsi="Segoe UI"/>
-          <w:b/>
-          <w:color w:val="1E3442"/>
-          <w:sz w:val="30"/>
-        </w:rPr>
-        <w:t>7. KẾT LUẬN VÀ HƯỚNG PHÁT TRIỂN TIẾP THEO</w:t>
-      </w:r>
-    </w:p>
-    <w:p>
-      <w:pPr>
-        <w:keepNext/>
-        <w:spacing w:before="260" w:after="80"/>
-      </w:pPr>
-      <w:r>
-        <w:rPr>
-          <w:rFonts w:ascii="Segoe UI" w:hAnsi="Segoe UI"/>
-          <w:b/>
-          <w:color w:val="56788A"/>
-          <w:sz w:val="25"/>
-        </w:rPr>
-        <w:t>7.1. Kết luận</w:t>
-      </w:r>
-    </w:p>
-    <w:p>
-      <w:pPr>
-        <w:spacing w:after="80" w:line="288" w:lineRule="auto"/>
-      </w:pPr>
-      <w:r>
-        <w:rPr>
-          <w:rFonts w:ascii="Segoe UI" w:hAnsi="Segoe UI"/>
-          <w:i w:val="0"/>
-          <w:color w:val="1F2A33"/>
-          <w:sz w:val="22"/>
-        </w:rPr>
-        <w:t>Nhật ký sử dụng AI này minh chứng rằng việc ứng dụng Trí tuệ Nhân tạo có phương pháp, có nguyên tắc kỹ thuật và sự kiểm soát nghiêm ngặt của con người đã giúp đề án PetCare POS đạt được chất lượng vượt bậc về kiến trúc 3 lớp, giao diện phẳng chuẩn mực và logic nghiệp vụ thực tế sâu sắc.</w:t>
-      </w:r>
-    </w:p>
-    <w:p>
-      <w:pPr>
-        <w:keepNext/>
-        <w:spacing w:before="260" w:after="80"/>
-      </w:pPr>
-      <w:r>
-        <w:rPr>
-          <w:rFonts w:ascii="Segoe UI" w:hAnsi="Segoe UI"/>
-          <w:b/>
-          <w:color w:val="56788A"/>
-          <w:sz w:val="25"/>
-        </w:rPr>
-        <w:t>7.2. Hướng phát triển tiếp theo</w:t>
+        <w:t>Khi tái sử dụng một Dialog cho cả 'Thêm mới' và 'Chỉnh sửa', nếu không reset form sạch sẽ thì form thêm mới sẽ luôn mang dữ liệu của lần thao tác trước. Bài học: Định nghĩa rõ ràng biến cờ boolean isEdit và hàm resetForm().</w:t>
       </w:r>
     </w:p>
     <w:p>
@@ -3373,7 +2630,7 @@
           <w:color w:val="1F2A33"/>
           <w:sz w:val="21"/>
         </w:rPr>
-        <w:t xml:space="preserve">Gợi ý điều trị AI: </w:t>
+        <w:t xml:space="preserve">3. Vai trò kiểm soát của con người: </w:t>
       </w:r>
       <w:r>
         <w:rPr>
@@ -3381,7 +2638,36 @@
           <w:color w:val="1F2A33"/>
           <w:sz w:val="21"/>
         </w:rPr>
-        <w:t>Tích hợp mô hình AI phân tích tiền sử bệnh án thú cưng để tự động gợi ý phác đồ điều trị và cảnh báo tương tác thuốc.</w:t>
+        <w:t>AI có thể sinh mã nguồn rất nhanh, nhưng chỉ con người mới phát hiện được sự phi lý trong nghiệp vụ (như kê đơn phải chọn thuốc từ kho, kê xong phải trừ kho, thú cưng điều trị xong phải cập nhật tiến độ phác đồ).</w:t>
+      </w:r>
+    </w:p>
+    <w:p>
+      <w:pPr>
+        <w:keepNext/>
+        <w:spacing w:before="320" w:after="120"/>
+      </w:pPr>
+      <w:r>
+        <w:rPr>
+          <w:rFonts w:ascii="Segoe UI" w:hAnsi="Segoe UI"/>
+          <w:b/>
+          <w:color w:val="1E3442"/>
+          <w:sz w:val="29"/>
+        </w:rPr>
+        <w:t>7. KẾT LUẬN VÀ ĐỊNH HƯỚNG MỞ RỘNG</w:t>
+      </w:r>
+    </w:p>
+    <w:p>
+      <w:pPr>
+        <w:spacing w:after="80" w:line="288" w:lineRule="auto"/>
+      </w:pPr>
+      <w:r>
+        <w:rPr>
+          <w:rFonts w:ascii="Segoe UI" w:hAnsi="Segoe UI"/>
+          <w:i w:val="0"/>
+          <w:color w:val="1F2A33"/>
+          <w:sz w:val="22"/>
+        </w:rPr>
+        <w:t>Nhật ký AI này chứng minh rằng việc áp dụng Trí tuệ Nhân tạo tập trung vào 4 phân hệ trọng yếu: Quản lý Thú cưng, Quản lý Kho hàng, Quản lý Đơn thuốc và Phác đồ Điều trị đã đem lại bước đột phá lớn cho đề án PetCare POS. Hệ thống vừa đảm bảo logic y tế chặt chẽ, vừa mang lại trải nghiệm giao diện hiện đại, trực quan và chuyên nghiệp.</w:t>
       </w:r>
     </w:p>
     <w:p>
@@ -3397,7 +2683,7 @@
           <w:color w:val="1F2A33"/>
           <w:sz w:val="21"/>
         </w:rPr>
-        <w:t xml:space="preserve">Tự động hóa chăm sóc khách hàng: </w:t>
+        <w:t xml:space="preserve">Hướng mở rộng 1: </w:t>
       </w:r>
       <w:r>
         <w:rPr>
@@ -3405,7 +2691,31 @@
           <w:color w:val="1F2A33"/>
           <w:sz w:val="21"/>
         </w:rPr>
-        <w:t>Mở rộng kết nối cơ sở dữ liệu đám mây (Cloud Database) và chatbot AI tự động tiếp nhận lịch hẹn của khách hàng qua Zalo/Facebook.</w:t>
+        <w:t>Ứng dụng mô hình AI phân tích tiền sử bệnh án thú cưng để tự động gợi ý phác đồ điều trị và cảnh báo tương tác thuốc có hại.</w:t>
+      </w:r>
+    </w:p>
+    <w:p>
+      <w:pPr>
+        <w:pStyle w:val="ListBullet"/>
+        <w:spacing w:after="60" w:line="276" w:lineRule="auto"/>
+        <w:ind w:left="360"/>
+      </w:pPr>
+      <w:r>
+        <w:rPr>
+          <w:rFonts w:ascii="Segoe UI" w:hAnsi="Segoe UI"/>
+          <w:b/>
+          <w:color w:val="1F2A33"/>
+          <w:sz w:val="21"/>
+        </w:rPr>
+        <w:t xml:space="preserve">Hướng mở rộng 2: </w:t>
+      </w:r>
+      <w:r>
+        <w:rPr>
+          <w:rFonts w:ascii="Segoe UI" w:hAnsi="Segoe UI"/>
+          <w:color w:val="1F2A33"/>
+          <w:sz w:val="21"/>
+        </w:rPr>
+        <w:t>Tích hợp cảnh báo thông minh khi kê đơn thuốc vượt quá liều lượng an toàn dựa trên cân nặng và loài thú cưng.</w:t>
       </w:r>
     </w:p>
     <w:p>
@@ -3430,7 +2740,7 @@
           <w:b/>
           <w:sz w:val="22"/>
         </w:rPr>
-        <w:t>ĐẠI DIỆN NHÓM PHÁT TRIỂN ĐỀ ÁN</w:t>
+        <w:t>SINH VIÊN PHỤ TRÁCH PHÂN HỆ</w:t>
         <w:br/>
         <w:br/>
         <w:br/>
@@ -3468,7 +2778,7 @@
         <w:color w:val="6B7A86"/>
         <w:sz w:val="18"/>
       </w:rPr>
-      <w:t xml:space="preserve">Báo Cáo Nhật Ký Sử Dụng Trí Tuệ Nhân Tạo (AI Logbook)  —  Trang </w:t>
+      <w:t xml:space="preserve">Đề Án PetCare POS  •  Báo Cáo Nhật Ký AI  —  Trang </w:t>
     </w:r>
     <w:fldSimple w:instr="PAGE"/>
   </w:p>
@@ -3488,7 +2798,7 @@
         <w:color w:val="8C9BA5"/>
         <w:sz w:val="17"/>
       </w:rPr>
-      <w:t>ĐỀ ÁN PHÁT TRIỂN ỨNG DỤNG  •  HỆ THỐNG QUẢN LÝ PHÒNG KHÁM THÚ Y (PETCARE POS)</w:t>
+      <w:t>NHẬT KÝ AI  •  QUẢN LÝ THÚ CƯNG, KHO HÀNG, ĐƠN THUỐC &amp; PHÁC ĐỒ ĐIỀU TRỊ</w:t>
     </w:r>
   </w:p>
 </w:hdr>

</xml_diff>